<commit_message>
Revisão v1.1: resposta à revisão adversarial nº 1 (exploratório)
Anterioridade sem prova externa declarada; carimbos OpenTimestamps dos
planos novos. T1: memória de cálculo, agregadas e escopo. T3 sem Censo:
conclusão mantida. T2: 4 especificações alternativas; a logit (mesmo com
peso corrigido) deixa 1.276 seções em redutos do 13 sem explicação
demonstrada, pior caso 13,3% da margem. Veredito reescrito: não demonstra
ausência de fraude. Brutos D7 e D3 rebaixados conferem com o manifesto.

Co-Authored-By: Claude Opus 5.5 <noreply@anthropic.com>
</commit_message>
<xml_diff>
--- a/output/relatorio/relatorio_publico_eleicao_2026.docx
+++ b/output/relatorio/relatorio_publico_eleicao_2026.docx
@@ -44,7 +44,7 @@
           <w:sz w:val="28"/>
           <w:szCs w:val="28"/>
         </w:rPr>
-        <w:t xml:space="preserve">Boletins de urna, mapas, pesquisas e a virada entre turnos, examinados com um plano registrado antes da coleta dos dados</w:t>
+        <w:t xml:space="preserve">Boletins de urna, mapas, pesquisas e a virada entre turnos, examinados com plano, critérios e dados publicados</w:t>
       </w:r>
     </w:p>
     <w:p>
@@ -59,7 +59,7 @@
         <w:t xml:space="preserve">Leandro Marques Pitol</w:t>
       </w:r>
       <w:r>
-        <w:t xml:space="preserve"> · 28 de outubro de 2026</w:t>
+        <w:t xml:space="preserve"> · versão 1.1, 29 de outubro de 2026 (v1.0: 28 de outubro de 2026)</w:t>
       </w:r>
     </w:p>
     <w:p>
@@ -72,7 +72,7 @@
           <w:iCs/>
           <w:color w:val="52514E"/>
         </w:rPr>
-        <w:t xml:space="preserve">Versão preliminar, aberta à revisão pública e adversarial</w:t>
+        <w:t xml:space="preserve">Versão preliminar, revisada após a primeira revisão crítica e aberta a novas revisões</w:t>
       </w:r>
     </w:p>
     <w:p>
@@ -137,7 +137,7 @@
             <w:pPr>
               <w:spacing w:after="140" w:line="300"/>
             </w:pPr>
-            <w:hyperlink w:history="1" r:id="rIdx17mzzigz95lnce1ngwvh">
+            <w:hyperlink w:history="1" r:id="rId3jqs5bac7q_zbswyojwg-">
               <w:r>
                 <w:rPr>
                   <w:rStyle w:val="Hyperlink"/>
@@ -181,7 +181,7 @@
         <w:spacing w:after="140" w:line="300"/>
       </w:pPr>
       <w:r>
-        <w:t xml:space="preserve">Após o 2º turno presidencial de 25 de outubro de 2026, em que Luiz Inácio Lula da Silva (número 13) venceu Flavio Nantes Bolsonaro (número 22) depois de terminar o 1º turno em segundo lugar, circularam alegações de que o resultado seria "milagroso" ou estatisticamente improvável. Este trabalho testou essas ideias com dados públicos do TSE e do IBGE, seguindo um plano fixado antes de qualquer download. Os principais resultados:</w:t>
+        <w:t xml:space="preserve">Após o 2º turno presidencial de 25 de outubro de 2026, em que Luiz Inácio Lula da Silva (número 13) venceu Flavio Nantes Bolsonaro (número 22) depois de terminar o 1º turno em segundo lugar, circularam alegações de que o resultado seria "milagroso" ou estatisticamente improvável. Este trabalho testou essas ideias com dados públicos do TSE e do IBGE, seguindo um plano escrito antes da coleta (o histórico do Git registra essa ordem, mas sem prova externa; veja a seção 2.1). Os principais resultados:</w:t>
       </w:r>
     </w:p>
     <w:p>
@@ -198,10 +198,10 @@
           <w:b/>
           <w:bCs/>
         </w:rPr>
-        <w:t xml:space="preserve">A contagem bateu. </w:t>
-      </w:r>
-      <w:r>
-        <w:t xml:space="preserve">Em 5.692 urnas sorteadas em todo o país, todas as assinaturas digitais dos boletins de urna foram validadas e a soma dos votos coincidiu com o resultado oficial: 0 divergências em 1.459.681 votos conferidos.</w:t>
+        <w:t xml:space="preserve">A contagem bateu na amostra. </w:t>
+      </w:r>
+      <w:r>
+        <w:t xml:space="preserve">Em 5.692 urnas sorteadas em todo o país, todas as assinaturas digitais dos boletins de urna foram validadas e a soma dos votos coincidiu com o resultado oficial: 0 divergências em 1.459.681 votos conferidos. Por ser amostra, isso limita (não elimina) a possibilidade de urnas com problema no país: no máximo 0,0648%, com 95% de confiança.</w:t>
       </w:r>
     </w:p>
     <w:p>
@@ -221,7 +221,7 @@
         <w:t xml:space="preserve">O mapa não tem nada de novo. </w:t>
       </w:r>
       <w:r>
-        <w:t xml:space="preserve">O padrão geográfico do que os modelos não conseguem explicar em 2026 está dentro do observado em 2014, 2018 e 2022, e nenhum aglomerado de municípios aparece apenas em 2026.</w:t>
+        <w:t xml:space="preserve">O padrão geográfico do que os modelos não conseguem explicar em 2026 está dentro do observado em 2014, 2018 e 2022, e nenhum aglomerado de municípios aparece apenas em 2026. O resultado se mantém quando o modelo é refeito sem os dados do Censo.</w:t>
       </w:r>
     </w:p>
     <w:p>
@@ -238,10 +238,10 @@
           <w:b/>
           <w:bCs/>
         </w:rPr>
-        <w:t xml:space="preserve">Há seções atípicas, mas poucas e irrelevantes para o resultado. </w:t>
-      </w:r>
-      <w:r>
-        <w:t xml:space="preserve">461 seções eleitorais fogem do previsto pelo modelo; concentram-se em seções pequenas e aldeias indígenas e somam 1,26% da margem de votos, incapazes de alterar o resultado.</w:t>
+        <w:t xml:space="preserve">Há seções atípicas, e nem todas estão explicadas, mas nenhuma conta chega perto da margem. </w:t>
+      </w:r>
+      <w:r>
+        <w:t xml:space="preserve">No modelo principal, 461 seções fogem do previsto, concentradas em seções pequenas e aldeias indígenas; no pior caso, mexeriam em 2,5% da margem. Uma especificação alternativa aponta 1.276 seções em redutos do 13, ainda sem explicação demonstrada (pior caso: 13,3% da margem).</w:t>
       </w:r>
     </w:p>
     <w:p>
@@ -261,7 +261,7 @@
         <w:t xml:space="preserve">As pesquisas erraram todas para o mesmo lado. </w:t>
       </w:r>
       <w:r>
-        <w:t xml:space="preserve">As 19 pesquisas finais superestimaram o candidato 22, em média por 5,2 pontos na margem entre os dois.</w:t>
+        <w:t xml:space="preserve">As 19 pesquisas finais superestimaram o candidato 22, em média por 5,2 pontos na margem entre os dois. Como os institutos compartilham métodos e vieses, isso não equivale a 19 erros independentes.</w:t>
       </w:r>
     </w:p>
     <w:p>
@@ -281,7 +281,7 @@
         <w:t xml:space="preserve">A virada não é rara para uma vantagem tão pequena. </w:t>
       </w:r>
       <w:r>
-        <w:t xml:space="preserve">O candidato 22 liderou o 1º turno por 1,9 ponto percentual. Em 42 segundos turnos de seis países, viradas com vantagem desse tamanho acontecem em cerca de 49% dos casos. O que foi excepcional foi a magnitude: o 13 ficou com 73,6% dos votos novos entre os turnos, a maior parcela da série brasileira.</w:t>
+        <w:t xml:space="preserve">O candidato 22 liderou o 1º turno por 1,9 ponto percentual. Em 42 segundos turnos de seis países, viradas com vantagem desse tamanho acontecem em algo da ordem de metade dos casos, com grande incerteza (de 27 a 71%). O que foi excepcional foi a magnitude: o 13 ficou com 73,6% dos votos novos entre os turnos, a maior parcela da série brasileira.</w:t>
       </w:r>
     </w:p>
     <w:p>
@@ -301,32 +301,7 @@
         <w:t xml:space="preserve">Veredito, pelas regras fixadas antes: </w:t>
       </w:r>
       <w:r>
-        <w:t xml:space="preserve">desfecho B, "anomalia com causa mundana". Nenhuma divergência de contagem foi encontrada no escopo analisado, e nenhum achado tem tamanho capaz de mudar o resultado nacional.</w:t>
-      </w:r>
-    </w:p>
-    <w:p>
-      <w:pPr>
-        <w:pStyle w:val="Heading1"/>
-        <w:spacing w:after="160" w:before="360"/>
-      </w:pPr>
-      <w:r>
-        <w:t xml:space="preserve">1. A pergunta e as regras do jogo</w:t>
-      </w:r>
-    </w:p>
-    <w:p>
-      <w:pPr>
-        <w:spacing w:after="140" w:line="300"/>
-      </w:pPr>
-      <w:r>
-        <w:t xml:space="preserve">A pergunta central foi escrita assim, antes de olhar os dados: o resultado do 2º turno de 2026 é consistente com o processo eleitoral tal como documentado nos registros públicos, ou existem anomalias localizadas que fatores demográficos, políticos e o erro amostral conhecido não explicam?</w:t>
-      </w:r>
-    </w:p>
-    <w:p>
-      <w:pPr>
-        <w:spacing w:after="140" w:line="300"/>
-      </w:pPr>
-      <w:r>
-        <w:t xml:space="preserve">O estudo não parte do pressuposto de que houve fraude, nem de que não houve. Para impedir que o resultado fosse moldado pelo que se desejava encontrar, o trabalho seguiu quatro regras:</w:t>
+        <w:t xml:space="preserve">desfecho B do plano. Os achados são localizados e não têm tamanho para mudar o resultado nacional; são compatíveis com limitações do modelo, mas nem todos receberam explicação causal demonstrada.</w:t>
       </w:r>
     </w:p>
     <w:p>
@@ -343,10 +318,35 @@
           <w:b/>
           <w:bCs/>
         </w:rPr>
-        <w:t xml:space="preserve">Plano congelado antes dos dados. </w:t>
-      </w:r>
-      <w:r>
-        <w:t xml:space="preserve">Hipóteses, testes, limiares e critérios de decisão foram registrados e versionados antes do primeiro download (veja a cadeia de custódia, na seção 2).</w:t>
+        <w:t xml:space="preserve">O que este trabalho não demonstra. </w:t>
+      </w:r>
+      <w:r>
+        <w:t xml:space="preserve">Ele não prova ausência de fraude. Mostra que não houve divergência de contagem na amostra examinada e que os padrões estatísticos de 2026 são compatíveis com os de eleições anteriores.</w:t>
+      </w:r>
+    </w:p>
+    <w:p>
+      <w:pPr>
+        <w:pStyle w:val="Heading1"/>
+        <w:spacing w:after="160" w:before="360"/>
+      </w:pPr>
+      <w:r>
+        <w:t xml:space="preserve">1. A pergunta e as regras do jogo</w:t>
+      </w:r>
+    </w:p>
+    <w:p>
+      <w:pPr>
+        <w:spacing w:after="140" w:line="300"/>
+      </w:pPr>
+      <w:r>
+        <w:t xml:space="preserve">A pergunta central foi escrita assim, antes de olhar os dados: o resultado do 2º turno de 2026 é consistente com o processo eleitoral tal como documentado nos registros públicos, ou existem anomalias localizadas que fatores demográficos, políticos e o erro amostral conhecido não explicam?</w:t>
+      </w:r>
+    </w:p>
+    <w:p>
+      <w:pPr>
+        <w:spacing w:after="140" w:line="300"/>
+      </w:pPr>
+      <w:r>
+        <w:t xml:space="preserve">O estudo não parte do pressuposto de que houve fraude, nem de que não houve. Para impedir que o resultado fosse moldado pelo que se desejava encontrar, o trabalho seguiu quatro regras:</w:t>
       </w:r>
     </w:p>
     <w:p>
@@ -363,10 +363,10 @@
           <w:b/>
           <w:bCs/>
         </w:rPr>
-        <w:t xml:space="preserve">Nada de inventar métrica depois de ver o resultado. </w:t>
-      </w:r>
-      <w:r>
-        <w:t xml:space="preserve">Qualquer ajuste posterior foi anotado, com data e justificativa, num registro público de desvios (17 entradas). Resultados afetados são marcados como exploratórios e não entram no veredito.</w:t>
+        <w:t xml:space="preserve">Plano escrito antes dos dados. </w:t>
+      </w:r>
+      <w:r>
+        <w:t xml:space="preserve">Hipóteses, testes, limiares e critérios de decisão foram registrados no Git antes do primeiro download, segundo as datas do histórico. A seção 2.1 explica o limite dessa prova e o carimbo externo adotado depois.</w:t>
       </w:r>
     </w:p>
     <w:p>
@@ -383,10 +383,10 @@
           <w:b/>
           <w:bCs/>
         </w:rPr>
-        <w:t xml:space="preserve">Todos os testes são publicados, inclusive os que não acharam nada. </w:t>
-      </w:r>
-      <w:r>
-        <w:t xml:space="preserve">Um estudo que só divulga o que confirma a suspeita inicial é advocacia, não investigação.</w:t>
+        <w:t xml:space="preserve">Nada de inventar métrica depois de ver o resultado. </w:t>
+      </w:r>
+      <w:r>
+        <w:t xml:space="preserve">Qualquer ajuste posterior foi anotado, com data e justificativa, num registro público de desvios (18 entradas). Resultados afetados são marcados como exploratórios e não entram no veredito.</w:t>
       </w:r>
     </w:p>
     <w:p>
@@ -403,6 +403,26 @@
           <w:b/>
           <w:bCs/>
         </w:rPr>
+        <w:t xml:space="preserve">Todos os testes são publicados, inclusive os que não acharam nada. </w:t>
+      </w:r>
+      <w:r>
+        <w:t xml:space="preserve">Um estudo que só divulga o que confirma a suspeita inicial é advocacia, não investigação.</w:t>
+      </w:r>
+    </w:p>
+    <w:p>
+      <w:pPr>
+        <w:pStyle w:val="ListParagraph"/>
+        <w:numPr>
+          <w:ilvl w:val="0"/>
+          <w:numId w:val="2"/>
+        </w:numPr>
+        <w:spacing w:after="90" w:line="290"/>
+      </w:pPr>
+      <w:r>
+        <w:rPr>
+          <w:b/>
+          <w:bCs/>
+        </w:rPr>
         <w:t xml:space="preserve">"Não consigo explicar" não é "foi fraudado". </w:t>
       </w:r>
       <w:r>
@@ -440,7 +460,7 @@
         <w:spacing w:after="120" w:before="240"/>
       </w:pPr>
       <w:r>
-        <w:t xml:space="preserve">2.1 O plano foi registrado antes dos dados</w:t>
+        <w:t xml:space="preserve">2.1 O plano e a ordem dos eventos: o que está provado e o que não está</w:t>
       </w:r>
     </w:p>
     <w:p>
@@ -448,9 +468,9 @@
         <w:spacing w:after="140" w:line="300"/>
       </w:pPr>
       <w:r>
-        <w:t xml:space="preserve">O documento de pré-registro foi copiado sem alterações e congelado no commit </w:t>
-      </w:r>
-      <w:hyperlink w:history="1" r:id="rIdewxfqbhbkq5deph2v4bfy">
+        <w:t xml:space="preserve">O documento de pré-registro foi copiado sem alterações e registrado no commit </w:t>
+      </w:r>
+      <w:hyperlink w:history="1" r:id="rIdiq1elzr0fes7robr2txhl">
         <w:r>
           <w:rPr>
             <w:rStyle w:val="Hyperlink"/>
@@ -459,9 +479,9 @@
         </w:r>
       </w:hyperlink>
       <w:r>
-        <w:t xml:space="preserve"> (2026-10-28 12:08), antes de qualquer download. A impressão digital (SHA-256) do arquivo </w:t>
-      </w:r>
-      <w:hyperlink w:history="1" r:id="rIdk2jxf6bgpcjxk3qgjpahj">
+        <w:t xml:space="preserve"> (2026-10-28 12:08, horário do computador do autor), antes do primeiro download segundo o histórico do Git. A impressão digital (SHA-256) do arquivo </w:t>
+      </w:r>
+      <w:hyperlink w:history="1" r:id="rId8sbj3aii0eivz0zgt8rsn">
         <w:r>
           <w:rPr>
             <w:rStyle w:val="Hyperlink"/>
@@ -486,12 +506,143 @@
         <w:t xml:space="preserve">5a8dced79fc37588cf63b5c774998f8d1ac2478c9bef67c32c98fb5d2d3e42fd</w:t>
       </w:r>
     </w:p>
+    <w:tbl>
+      <w:tblPr>
+        <w:tblW w:type="dxa" w:w="9638"/>
+        <w:tblBorders>
+          <w:top w:val="single" w:color="auto" w:sz="4"/>
+          <w:left w:val="single" w:color="auto" w:sz="4"/>
+          <w:bottom w:val="single" w:color="auto" w:sz="4"/>
+          <w:right w:val="single" w:color="auto" w:sz="4"/>
+          <w:insideH w:val="single" w:color="auto" w:sz="4"/>
+          <w:insideV w:val="single" w:color="auto" w:sz="4"/>
+        </w:tblBorders>
+      </w:tblPr>
+      <w:tblGrid>
+        <w:gridCol w:w="9638"/>
+      </w:tblGrid>
+      <w:tr>
+        <w:tc>
+          <w:tcPr>
+            <w:tcW w:type="dxa" w:w="9638"/>
+            <w:tcBorders>
+              <w:top w:val="single" w:color="1F4E79" w:sz="18"/>
+              <w:left w:val="single" w:color="D0D5DD" w:sz="4"/>
+              <w:bottom w:val="single" w:color="D0D5DD" w:sz="4"/>
+              <w:right w:val="single" w:color="D0D5DD" w:sz="4"/>
+            </w:tcBorders>
+            <w:shd w:fill="F2F4F7" w:color="auto" w:val="clear"/>
+            <w:tcMar>
+              <w:top w:type="dxa" w:w="140"/>
+              <w:left w:type="dxa" w:w="200"/>
+              <w:bottom w:type="dxa" w:w="140"/>
+              <w:right w:type="dxa" w:w="200"/>
+            </w:tcMar>
+          </w:tcPr>
+          <w:p>
+            <w:pPr>
+              <w:spacing w:after="0"/>
+            </w:pPr>
+            <w:r>
+              <w:rPr>
+                <w:b/>
+                <w:bCs/>
+              </w:rPr>
+              <w:t xml:space="preserve">Limite da prova. </w:t>
+            </w:r>
+            <w:r>
+              <w:t xml:space="preserve">O horário de um commit é registrado pelo próprio computador de quem o faz e pode ser informado livremente. Os commits deste trabalho só chegaram ao GitHub em 2026-10-28 20:42:54 UTC, de uma vez. Por isso não existe prova externa de que o plano foi escrito antes da coleta. A cadeia de hashes prova que nada foi alterado depois de publicado, mas não prova a ordem dos eventos anteriores. Essa limitação foi apontada na primeira revisão crítica e é aceita aqui.</w:t>
+            </w:r>
+          </w:p>
+        </w:tc>
+      </w:tr>
+    </w:tbl>
+    <w:p>
+      <w:pPr>
+        <w:spacing w:after="120"/>
+      </w:pPr>
+    </w:p>
     <w:p>
       <w:pPr>
         <w:spacing w:after="140" w:line="300"/>
       </w:pPr>
       <w:r>
-        <w:t xml:space="preserve">Um commit do Git funciona como um carimbo encadeado: cada um depende do anterior, de modo que alterar um arquivo antigo mudaria todos os identificadores seguintes. O histórico público não foi reescrito.</w:t>
+        <w:t xml:space="preserve">O que foi feito a partir da revisão: os planos de toda análise nova passaram a receber carimbo temporal externo (OpenTimestamps, ancorado na rede Bitcoin) antes de serem executados. Qualquer pessoa pode conferir esses carimbos em opentimestamps.org. Foram carimbados:</w:t>
+      </w:r>
+    </w:p>
+    <w:p>
+      <w:pPr>
+        <w:pStyle w:val="ListParagraph"/>
+        <w:numPr>
+          <w:ilvl w:val="0"/>
+          <w:numId w:val="2"/>
+        </w:numPr>
+        <w:spacing w:after="90" w:line="290"/>
+      </w:pPr>
+      <w:hyperlink w:history="1" r:id="rIdubp9zxpnjzygnywv8ypx9">
+        <w:r>
+          <w:rPr>
+            <w:rStyle w:val="Hyperlink"/>
+          </w:rPr>
+          <w:t xml:space="preserve">docs/carimbos/estado_v1_0.txt</w:t>
+        </w:r>
+      </w:hyperlink>
+      <w:r>
+        <w:rPr>
+          <w:sz w:val="18"/>
+          <w:szCs w:val="18"/>
+        </w:rPr>
+        <w:t xml:space="preserve"> (+ .ots), SHA-256 492c8128b0501ee1…</w:t>
+      </w:r>
+    </w:p>
+    <w:p>
+      <w:pPr>
+        <w:pStyle w:val="ListParagraph"/>
+        <w:numPr>
+          <w:ilvl w:val="0"/>
+          <w:numId w:val="2"/>
+        </w:numPr>
+        <w:spacing w:after="90" w:line="290"/>
+      </w:pPr>
+      <w:hyperlink w:history="1" r:id="rIdplmk_8dpo2edqjsmj6l4v">
+        <w:r>
+          <w:rPr>
+            <w:rStyle w:val="Hyperlink"/>
+          </w:rPr>
+          <w:t xml:space="preserve">docs/plano_v1_1.md</w:t>
+        </w:r>
+      </w:hyperlink>
+      <w:r>
+        <w:rPr>
+          <w:sz w:val="18"/>
+          <w:szCs w:val="18"/>
+        </w:rPr>
+        <w:t xml:space="preserve"> (+ .ots), SHA-256 1b5b93b6c38596ff…</w:t>
+      </w:r>
+    </w:p>
+    <w:p>
+      <w:pPr>
+        <w:pStyle w:val="ListParagraph"/>
+        <w:numPr>
+          <w:ilvl w:val="0"/>
+          <w:numId w:val="2"/>
+        </w:numPr>
+        <w:spacing w:after="90" w:line="290"/>
+      </w:pPr>
+      <w:hyperlink w:history="1" r:id="rIdqngxt8brecg_--wdykk47">
+        <w:r>
+          <w:rPr>
+            <w:rStyle w:val="Hyperlink"/>
+          </w:rPr>
+          <w:t xml:space="preserve">docs/plano_v1_1_adendo.md</w:t>
+        </w:r>
+      </w:hyperlink>
+      <w:r>
+        <w:rPr>
+          <w:sz w:val="18"/>
+          <w:szCs w:val="18"/>
+        </w:rPr>
+        <w:t xml:space="preserve"> (+ .ots), SHA-256 83a3b39488de8063…</w:t>
       </w:r>
     </w:p>
     <w:p>
@@ -510,7 +661,7 @@
       <w:r>
         <w:t xml:space="preserve">Os 17.611 arquivos obtidos das fontes oficiais estão listados no </w:t>
       </w:r>
-      <w:hyperlink w:history="1" r:id="rIdoyqi8gqy1xhlohveobm_i">
+      <w:hyperlink w:history="1" r:id="rIdlf0kyfj0irwymzhnd34ba">
         <w:r>
           <w:rPr>
             <w:rStyle w:val="Hyperlink"/>
@@ -2146,7 +2297,7 @@
         <w:spacing w:after="140" w:line="300"/>
       </w:pPr>
       <w:r>
-        <w:t xml:space="preserve">Os arquivos originais ficam numa pasta tratada como imutável. Toda transformação ocorre em scripts versionados, que leem os brutos e gravam resultados em outra pasta. Um verificador automático confere os 17.611 arquivos contra o manifesto; na última execução, não houve nenhuma divergência.</w:t>
+        <w:t xml:space="preserve">Os arquivos originais ficam numa pasta tratada como imutável. Toda transformação ocorre em scripts versionados, que leem os brutos e gravam resultados em outra pasta. Um verificador automático confere os 17.611 arquivos contra o manifesto; na última execução, não houve nenhuma divergência. Na revisão 1.1, os brutos já apagados para liberar espaço precisaram ser baixados de novo das fontes oficiais: 2 de 2 conferiram byte a byte com o SHA-256 registrado um dia antes, o que mostra na prática que a cadeia pode ser reconstruída.</w:t>
       </w:r>
     </w:p>
     <w:p>
@@ -2165,7 +2316,7 @@
       <w:r>
         <w:t xml:space="preserve">O </w:t>
       </w:r>
-      <w:hyperlink w:history="1" r:id="rIdusjqtzxxnrsnj-tuwqgnp">
+      <w:hyperlink w:history="1" r:id="rIdwq_mavgrtz6e46khk1n5d">
         <w:r>
           <w:rPr>
             <w:rStyle w:val="Hyperlink"/>
@@ -2174,7 +2325,7 @@
         </w:r>
       </w:hyperlink>
       <w:r>
-        <w:t xml:space="preserve"> tem 17 entradas. Entre elas estão os detalhes operacionais que o plano deixava em aberto (fixados antes de cada etapa), falhas de disponibilidade das fontes, correções de erros encontrados durante a análise e análises adicionais pedidas depois, todas marcadas como exploratórias.</w:t>
+        <w:t xml:space="preserve"> tem 18 entradas. Entre elas estão os detalhes operacionais que o plano deixava em aberto (fixados antes de cada etapa), falhas de disponibilidade das fontes, correções de erros encontrados durante a análise e análises adicionais pedidas depois, todas marcadas como exploratórias.</w:t>
       </w:r>
     </w:p>
     <w:p>
@@ -2324,7 +2475,7 @@
             </w:tcMar>
           </w:tcPr>
           <w:p>
-            <w:hyperlink w:history="1" r:id="rIdvfgr9jyccq6qbmwpzfce6">
+            <w:hyperlink w:history="1" r:id="rIdrddqzcpgmfkzn2trt6lfa">
               <w:r>
                 <w:rPr>
                   <w:rStyle w:val="Hyperlink"/>
@@ -2409,7 +2560,7 @@
             </w:tcMar>
           </w:tcPr>
           <w:p>
-            <w:hyperlink w:history="1" r:id="rIdy5nen6egepvxrdo6uur2r">
+            <w:hyperlink w:history="1" r:id="rId1ooxmhnyp2mjpc9ojblcg">
               <w:r>
                 <w:rPr>
                   <w:rStyle w:val="Hyperlink"/>
@@ -2494,7 +2645,7 @@
             </w:tcMar>
           </w:tcPr>
           <w:p>
-            <w:hyperlink w:history="1" r:id="rIdjv7gfwtpjn5a2h976nrea">
+            <w:hyperlink w:history="1" r:id="rIdnpij94j0y2yiqgxwy7c5s">
               <w:r>
                 <w:rPr>
                   <w:rStyle w:val="Hyperlink"/>
@@ -2579,7 +2730,7 @@
             </w:tcMar>
           </w:tcPr>
           <w:p>
-            <w:hyperlink w:history="1" r:id="rIdoggnypdigqw6vka207uhf">
+            <w:hyperlink w:history="1" r:id="rIdjg2bd1mimgx5ywdmmek4h">
               <w:r>
                 <w:rPr>
                   <w:rStyle w:val="Hyperlink"/>
@@ -2664,7 +2815,7 @@
             </w:tcMar>
           </w:tcPr>
           <w:p>
-            <w:hyperlink w:history="1" r:id="rIdhu_mhikv3hia_38oyogsg">
+            <w:hyperlink w:history="1" r:id="rId6xaerucn0dhcxvbfittaf">
               <w:r>
                 <w:rPr>
                   <w:rStyle w:val="Hyperlink"/>
@@ -2749,7 +2900,7 @@
             </w:tcMar>
           </w:tcPr>
           <w:p>
-            <w:hyperlink w:history="1" r:id="rIdaxdsa4e6eicjlsvvydb6l">
+            <w:hyperlink w:history="1" r:id="rId52jenzcbqdqy4wzeayikk">
               <w:r>
                 <w:rPr>
                   <w:rStyle w:val="Hyperlink"/>
@@ -2834,7 +2985,7 @@
             </w:tcMar>
           </w:tcPr>
           <w:p>
-            <w:hyperlink w:history="1" r:id="rIdetktk-4uz1tfimocvaxxe">
+            <w:hyperlink w:history="1" r:id="rIdxyalbezyhtqsxlpcvrhc2">
               <w:r>
                 <w:rPr>
                   <w:rStyle w:val="Hyperlink"/>
@@ -2919,7 +3070,7 @@
             </w:tcMar>
           </w:tcPr>
           <w:p>
-            <w:hyperlink w:history="1" r:id="rIduwxk_fpaw1dghyjnwdfx1">
+            <w:hyperlink w:history="1" r:id="rIdjwc4c7pptmtrenpg6mqug">
               <w:r>
                 <w:rPr>
                   <w:rStyle w:val="Hyperlink"/>
@@ -3004,7 +3155,7 @@
             </w:tcMar>
           </w:tcPr>
           <w:p>
-            <w:hyperlink w:history="1" r:id="rId8qzvw1xuq_mgrxjjgutsp">
+            <w:hyperlink w:history="1" r:id="rIdigmdvbt0su-2djw4hir9o">
               <w:r>
                 <w:rPr>
                   <w:rStyle w:val="Hyperlink"/>
@@ -3089,7 +3240,7 @@
             </w:tcMar>
           </w:tcPr>
           <w:p>
-            <w:hyperlink w:history="1" r:id="rId8dkuszl3ovxb9jrw_hsqc">
+            <w:hyperlink w:history="1" r:id="rIdjthv0ml3nfe9vyhl8qm0u">
               <w:r>
                 <w:rPr>
                   <w:rStyle w:val="Hyperlink"/>
@@ -3174,7 +3325,7 @@
             </w:tcMar>
           </w:tcPr>
           <w:p>
-            <w:hyperlink w:history="1" r:id="rIdziygmpg3zqtepqs_z_hzq">
+            <w:hyperlink w:history="1" r:id="rIdg4xtiqgewycoj-tubksvx">
               <w:r>
                 <w:rPr>
                   <w:rStyle w:val="Hyperlink"/>
@@ -3259,7 +3410,7 @@
             </w:tcMar>
           </w:tcPr>
           <w:p>
-            <w:hyperlink w:history="1" r:id="rId4bhkalh7vzya48zw9jnvo">
+            <w:hyperlink w:history="1" r:id="rId0q2p6aullbedek7ultl8b">
               <w:r>
                 <w:rPr>
                   <w:rStyle w:val="Hyperlink"/>
@@ -3344,7 +3495,7 @@
             </w:tcMar>
           </w:tcPr>
           <w:p>
-            <w:hyperlink w:history="1" r:id="rIdhz9tsxhvxea6aiarxh7cs">
+            <w:hyperlink w:history="1" r:id="rIdd6jrx_lgdkz3q1gcwovxw">
               <w:r>
                 <w:rPr>
                   <w:rStyle w:val="Hyperlink"/>
@@ -3429,7 +3580,7 @@
             </w:tcMar>
           </w:tcPr>
           <w:p>
-            <w:hyperlink w:history="1" r:id="rIdqygebh7x_8bajxhwyekja">
+            <w:hyperlink w:history="1" r:id="rIdf_nsqk0k_xlqsru2zmb2c">
               <w:r>
                 <w:rPr>
                   <w:rStyle w:val="Hyperlink"/>
@@ -3514,7 +3665,7 @@
             </w:tcMar>
           </w:tcPr>
           <w:p>
-            <w:hyperlink w:history="1" r:id="rId5hkxnjkpiumfirhortxya">
+            <w:hyperlink w:history="1" r:id="rIdo2kwwlkolfvvkcbbdhbr8">
               <w:r>
                 <w:rPr>
                   <w:rStyle w:val="Hyperlink"/>
@@ -3599,7 +3750,7 @@
             </w:tcMar>
           </w:tcPr>
           <w:p>
-            <w:hyperlink w:history="1" r:id="rIdc_xfpyzogal80asopa65x">
+            <w:hyperlink w:history="1" r:id="rIdb2mzpuojkv-s3c3g8_oiy">
               <w:r>
                 <w:rPr>
                   <w:rStyle w:val="Hyperlink"/>
@@ -3684,7 +3835,7 @@
             </w:tcMar>
           </w:tcPr>
           <w:p>
-            <w:hyperlink w:history="1" r:id="rIdud7odnpl-lnfu80xxawbv">
+            <w:hyperlink w:history="1" r:id="rId3putifffni9m8qxocm6yf">
               <w:r>
                 <w:rPr>
                   <w:rStyle w:val="Hyperlink"/>
@@ -3769,7 +3920,7 @@
             </w:tcMar>
           </w:tcPr>
           <w:p>
-            <w:hyperlink w:history="1" r:id="rIdvvvxnjw8xzb9fwq5ic_zf">
+            <w:hyperlink w:history="1" r:id="rId_fnhjoaoojk5bt3bioyyk">
               <w:r>
                 <w:rPr>
                   <w:rStyle w:val="Hyperlink"/>
@@ -3854,7 +4005,7 @@
             </w:tcMar>
           </w:tcPr>
           <w:p>
-            <w:hyperlink w:history="1" r:id="rIddwmfaocu7ufrngv-ypmji">
+            <w:hyperlink w:history="1" r:id="rIdlr4muzlhu_6d74qxcv-qj">
               <w:r>
                 <w:rPr>
                   <w:rStyle w:val="Hyperlink"/>
@@ -3917,6 +4068,516 @@
                 <w:szCs w:val="18"/>
               </w:rPr>
               <w:t xml:space="preserve">Publicação preliminar: licenças (MIT e CC BY 4.0) e aviso de revisão aberta</w:t>
+            </w:r>
+          </w:p>
+        </w:tc>
+      </w:tr>
+      <w:tr>
+        <w:tc>
+          <w:tcPr>
+            <w:tcW w:type="dxa" w:w="1100"/>
+            <w:tcBorders>
+              <w:top w:val="single" w:color="D0D5DD" w:sz="4"/>
+              <w:left w:val="single" w:color="D0D5DD" w:sz="4"/>
+              <w:bottom w:val="single" w:color="D0D5DD" w:sz="4"/>
+              <w:right w:val="single" w:color="D0D5DD" w:sz="4"/>
+            </w:tcBorders>
+            <w:tcMar>
+              <w:top w:type="dxa" w:w="60"/>
+              <w:left w:type="dxa" w:w="100"/>
+              <w:bottom w:type="dxa" w:w="60"/>
+              <w:right w:type="dxa" w:w="100"/>
+            </w:tcMar>
+          </w:tcPr>
+          <w:p>
+            <w:hyperlink w:history="1" r:id="rIddjvrhg8n6udmypjljgavj">
+              <w:r>
+                <w:rPr>
+                  <w:rStyle w:val="Hyperlink"/>
+                </w:rPr>
+                <w:t xml:space="preserve">76b3e61</w:t>
+              </w:r>
+            </w:hyperlink>
+          </w:p>
+        </w:tc>
+        <w:tc>
+          <w:tcPr>
+            <w:tcW w:type="dxa" w:w="1900"/>
+            <w:tcBorders>
+              <w:top w:val="single" w:color="D0D5DD" w:sz="4"/>
+              <w:left w:val="single" w:color="D0D5DD" w:sz="4"/>
+              <w:bottom w:val="single" w:color="D0D5DD" w:sz="4"/>
+              <w:right w:val="single" w:color="D0D5DD" w:sz="4"/>
+            </w:tcBorders>
+            <w:tcMar>
+              <w:top w:type="dxa" w:w="60"/>
+              <w:left w:type="dxa" w:w="100"/>
+              <w:bottom w:type="dxa" w:w="60"/>
+              <w:right w:type="dxa" w:w="100"/>
+            </w:tcMar>
+          </w:tcPr>
+          <w:p>
+            <w:r>
+              <w:rPr>
+                <w:b w:val="false"/>
+                <w:bCs w:val="false"/>
+                <w:sz w:val="18"/>
+                <w:szCs w:val="18"/>
+              </w:rPr>
+              <w:t xml:space="preserve">2026-10-28 17:54</w:t>
+            </w:r>
+          </w:p>
+        </w:tc>
+        <w:tc>
+          <w:tcPr>
+            <w:tcW w:type="dxa" w:w="6638"/>
+            <w:tcBorders>
+              <w:top w:val="single" w:color="D0D5DD" w:sz="4"/>
+              <w:left w:val="single" w:color="D0D5DD" w:sz="4"/>
+              <w:bottom w:val="single" w:color="D0D5DD" w:sz="4"/>
+              <w:right w:val="single" w:color="D0D5DD" w:sz="4"/>
+            </w:tcBorders>
+            <w:tcMar>
+              <w:top w:type="dxa" w:w="60"/>
+              <w:left w:type="dxa" w:w="100"/>
+              <w:bottom w:type="dxa" w:w="60"/>
+              <w:right w:type="dxa" w:w="100"/>
+            </w:tcMar>
+          </w:tcPr>
+          <w:p>
+            <w:r>
+              <w:rPr>
+                <w:b w:val="false"/>
+                <w:bCs w:val="false"/>
+                <w:sz w:val="18"/>
+                <w:szCs w:val="18"/>
+              </w:rPr>
+              <w:t xml:space="preserve">Relatório público (.docx) com resultados, cadeia de custódia e links</w:t>
+            </w:r>
+          </w:p>
+        </w:tc>
+      </w:tr>
+      <w:tr>
+        <w:tc>
+          <w:tcPr>
+            <w:tcW w:type="dxa" w:w="1100"/>
+            <w:tcBorders>
+              <w:top w:val="single" w:color="D0D5DD" w:sz="4"/>
+              <w:left w:val="single" w:color="D0D5DD" w:sz="4"/>
+              <w:bottom w:val="single" w:color="D0D5DD" w:sz="4"/>
+              <w:right w:val="single" w:color="D0D5DD" w:sz="4"/>
+            </w:tcBorders>
+            <w:tcMar>
+              <w:top w:type="dxa" w:w="60"/>
+              <w:left w:type="dxa" w:w="100"/>
+              <w:bottom w:type="dxa" w:w="60"/>
+              <w:right w:type="dxa" w:w="100"/>
+            </w:tcMar>
+          </w:tcPr>
+          <w:p>
+            <w:hyperlink w:history="1" r:id="rIdgdl0bzmqyakrjzfqza-pd">
+              <w:r>
+                <w:rPr>
+                  <w:rStyle w:val="Hyperlink"/>
+                </w:rPr>
+                <w:t xml:space="preserve">089befb</w:t>
+              </w:r>
+            </w:hyperlink>
+          </w:p>
+        </w:tc>
+        <w:tc>
+          <w:tcPr>
+            <w:tcW w:type="dxa" w:w="1900"/>
+            <w:tcBorders>
+              <w:top w:val="single" w:color="D0D5DD" w:sz="4"/>
+              <w:left w:val="single" w:color="D0D5DD" w:sz="4"/>
+              <w:bottom w:val="single" w:color="D0D5DD" w:sz="4"/>
+              <w:right w:val="single" w:color="D0D5DD" w:sz="4"/>
+            </w:tcBorders>
+            <w:tcMar>
+              <w:top w:type="dxa" w:w="60"/>
+              <w:left w:type="dxa" w:w="100"/>
+              <w:bottom w:type="dxa" w:w="60"/>
+              <w:right w:type="dxa" w:w="100"/>
+            </w:tcMar>
+          </w:tcPr>
+          <w:p>
+            <w:r>
+              <w:rPr>
+                <w:b w:val="false"/>
+                <w:bCs w:val="false"/>
+                <w:sz w:val="18"/>
+                <w:szCs w:val="18"/>
+              </w:rPr>
+              <w:t xml:space="preserve">2026-10-28 18:08</w:t>
+            </w:r>
+          </w:p>
+        </w:tc>
+        <w:tc>
+          <w:tcPr>
+            <w:tcW w:type="dxa" w:w="6638"/>
+            <w:tcBorders>
+              <w:top w:val="single" w:color="D0D5DD" w:sz="4"/>
+              <w:left w:val="single" w:color="D0D5DD" w:sz="4"/>
+              <w:bottom w:val="single" w:color="D0D5DD" w:sz="4"/>
+              <w:right w:val="single" w:color="D0D5DD" w:sz="4"/>
+            </w:tcBorders>
+            <w:tcMar>
+              <w:top w:type="dxa" w:w="60"/>
+              <w:left w:type="dxa" w:w="100"/>
+              <w:bottom w:type="dxa" w:w="60"/>
+              <w:right w:type="dxa" w:w="100"/>
+            </w:tcMar>
+          </w:tcPr>
+          <w:p>
+            <w:r>
+              <w:rPr>
+                <w:b w:val="false"/>
+                <w:bCs w:val="false"/>
+                <w:sz w:val="18"/>
+                <w:szCs w:val="18"/>
+              </w:rPr>
+              <w:t xml:space="preserve">Material de divulgação: imagem e texto para LinkedIn</w:t>
+            </w:r>
+          </w:p>
+        </w:tc>
+      </w:tr>
+      <w:tr>
+        <w:tc>
+          <w:tcPr>
+            <w:tcW w:type="dxa" w:w="1100"/>
+            <w:tcBorders>
+              <w:top w:val="single" w:color="D0D5DD" w:sz="4"/>
+              <w:left w:val="single" w:color="D0D5DD" w:sz="4"/>
+              <w:bottom w:val="single" w:color="D0D5DD" w:sz="4"/>
+              <w:right w:val="single" w:color="D0D5DD" w:sz="4"/>
+            </w:tcBorders>
+            <w:tcMar>
+              <w:top w:type="dxa" w:w="60"/>
+              <w:left w:type="dxa" w:w="100"/>
+              <w:bottom w:type="dxa" w:w="60"/>
+              <w:right w:type="dxa" w:w="100"/>
+            </w:tcMar>
+          </w:tcPr>
+          <w:p>
+            <w:hyperlink w:history="1" r:id="rIdja3cm9phzczjuysv31gzn">
+              <w:r>
+                <w:rPr>
+                  <w:rStyle w:val="Hyperlink"/>
+                </w:rPr>
+                <w:t xml:space="preserve">2f44c0a</w:t>
+              </w:r>
+            </w:hyperlink>
+          </w:p>
+        </w:tc>
+        <w:tc>
+          <w:tcPr>
+            <w:tcW w:type="dxa" w:w="1900"/>
+            <w:tcBorders>
+              <w:top w:val="single" w:color="D0D5DD" w:sz="4"/>
+              <w:left w:val="single" w:color="D0D5DD" w:sz="4"/>
+              <w:bottom w:val="single" w:color="D0D5DD" w:sz="4"/>
+              <w:right w:val="single" w:color="D0D5DD" w:sz="4"/>
+            </w:tcBorders>
+            <w:tcMar>
+              <w:top w:type="dxa" w:w="60"/>
+              <w:left w:type="dxa" w:w="100"/>
+              <w:bottom w:type="dxa" w:w="60"/>
+              <w:right w:type="dxa" w:w="100"/>
+            </w:tcMar>
+          </w:tcPr>
+          <w:p>
+            <w:r>
+              <w:rPr>
+                <w:b w:val="false"/>
+                <w:bCs w:val="false"/>
+                <w:sz w:val="18"/>
+                <w:szCs w:val="18"/>
+              </w:rPr>
+              <w:t xml:space="preserve">2026-10-29 09:38</w:t>
+            </w:r>
+          </w:p>
+        </w:tc>
+        <w:tc>
+          <w:tcPr>
+            <w:tcW w:type="dxa" w:w="6638"/>
+            <w:tcBorders>
+              <w:top w:val="single" w:color="D0D5DD" w:sz="4"/>
+              <w:left w:val="single" w:color="D0D5DD" w:sz="4"/>
+              <w:bottom w:val="single" w:color="D0D5DD" w:sz="4"/>
+              <w:right w:val="single" w:color="D0D5DD" w:sz="4"/>
+            </w:tcBorders>
+            <w:tcMar>
+              <w:top w:type="dxa" w:w="60"/>
+              <w:left w:type="dxa" w:w="100"/>
+              <w:bottom w:type="dxa" w:w="60"/>
+              <w:right w:type="dxa" w:w="100"/>
+            </w:tcMar>
+          </w:tcPr>
+          <w:p>
+            <w:r>
+              <w:rPr>
+                <w:b w:val="false"/>
+                <w:bCs w:val="false"/>
+                <w:sz w:val="18"/>
+                <w:szCs w:val="18"/>
+              </w:rPr>
+              <w:t xml:space="preserve">Plano da revisão v1.1 (antes de rodar análises novas) e estado a carimbar</w:t>
+            </w:r>
+          </w:p>
+        </w:tc>
+      </w:tr>
+      <w:tr>
+        <w:tc>
+          <w:tcPr>
+            <w:tcW w:type="dxa" w:w="1100"/>
+            <w:tcBorders>
+              <w:top w:val="single" w:color="D0D5DD" w:sz="4"/>
+              <w:left w:val="single" w:color="D0D5DD" w:sz="4"/>
+              <w:bottom w:val="single" w:color="D0D5DD" w:sz="4"/>
+              <w:right w:val="single" w:color="D0D5DD" w:sz="4"/>
+            </w:tcBorders>
+            <w:tcMar>
+              <w:top w:type="dxa" w:w="60"/>
+              <w:left w:type="dxa" w:w="100"/>
+              <w:bottom w:type="dxa" w:w="60"/>
+              <w:right w:type="dxa" w:w="100"/>
+            </w:tcMar>
+          </w:tcPr>
+          <w:p>
+            <w:hyperlink w:history="1" r:id="rIdgs64i_ax1tufglsesridm">
+              <w:r>
+                <w:rPr>
+                  <w:rStyle w:val="Hyperlink"/>
+                </w:rPr>
+                <w:t xml:space="preserve">40ed549</w:t>
+              </w:r>
+            </w:hyperlink>
+          </w:p>
+        </w:tc>
+        <w:tc>
+          <w:tcPr>
+            <w:tcW w:type="dxa" w:w="1900"/>
+            <w:tcBorders>
+              <w:top w:val="single" w:color="D0D5DD" w:sz="4"/>
+              <w:left w:val="single" w:color="D0D5DD" w:sz="4"/>
+              <w:bottom w:val="single" w:color="D0D5DD" w:sz="4"/>
+              <w:right w:val="single" w:color="D0D5DD" w:sz="4"/>
+            </w:tcBorders>
+            <w:tcMar>
+              <w:top w:type="dxa" w:w="60"/>
+              <w:left w:type="dxa" w:w="100"/>
+              <w:bottom w:type="dxa" w:w="60"/>
+              <w:right w:type="dxa" w:w="100"/>
+            </w:tcMar>
+          </w:tcPr>
+          <w:p>
+            <w:r>
+              <w:rPr>
+                <w:b w:val="false"/>
+                <w:bCs w:val="false"/>
+                <w:sz w:val="18"/>
+                <w:szCs w:val="18"/>
+              </w:rPr>
+              <w:t xml:space="preserve">2026-10-29 09:40</w:t>
+            </w:r>
+          </w:p>
+        </w:tc>
+        <w:tc>
+          <w:tcPr>
+            <w:tcW w:type="dxa" w:w="6638"/>
+            <w:tcBorders>
+              <w:top w:val="single" w:color="D0D5DD" w:sz="4"/>
+              <w:left w:val="single" w:color="D0D5DD" w:sz="4"/>
+              <w:bottom w:val="single" w:color="D0D5DD" w:sz="4"/>
+              <w:right w:val="single" w:color="D0D5DD" w:sz="4"/>
+            </w:tcBorders>
+            <w:tcMar>
+              <w:top w:type="dxa" w:w="60"/>
+              <w:left w:type="dxa" w:w="100"/>
+              <w:bottom w:type="dxa" w:w="60"/>
+              <w:right w:type="dxa" w:w="100"/>
+            </w:tcMar>
+          </w:tcPr>
+          <w:p>
+            <w:r>
+              <w:rPr>
+                <w:b w:val="false"/>
+                <w:bCs w:val="false"/>
+                <w:sz w:val="18"/>
+                <w:szCs w:val="18"/>
+              </w:rPr>
+              <w:t xml:space="preserve">Carimbo OpenTimestamps do plano v1.1 e do estado anterior, antes das análises novas</w:t>
+            </w:r>
+          </w:p>
+        </w:tc>
+      </w:tr>
+      <w:tr>
+        <w:tc>
+          <w:tcPr>
+            <w:tcW w:type="dxa" w:w="1100"/>
+            <w:tcBorders>
+              <w:top w:val="single" w:color="D0D5DD" w:sz="4"/>
+              <w:left w:val="single" w:color="D0D5DD" w:sz="4"/>
+              <w:bottom w:val="single" w:color="D0D5DD" w:sz="4"/>
+              <w:right w:val="single" w:color="D0D5DD" w:sz="4"/>
+            </w:tcBorders>
+            <w:tcMar>
+              <w:top w:type="dxa" w:w="60"/>
+              <w:left w:type="dxa" w:w="100"/>
+              <w:bottom w:type="dxa" w:w="60"/>
+              <w:right w:type="dxa" w:w="100"/>
+            </w:tcMar>
+          </w:tcPr>
+          <w:p>
+            <w:hyperlink w:history="1" r:id="rId1otxzsy7p7i4ncylwg30z">
+              <w:r>
+                <w:rPr>
+                  <w:rStyle w:val="Hyperlink"/>
+                </w:rPr>
+                <w:t xml:space="preserve">1628651</w:t>
+              </w:r>
+            </w:hyperlink>
+          </w:p>
+        </w:tc>
+        <w:tc>
+          <w:tcPr>
+            <w:tcW w:type="dxa" w:w="1900"/>
+            <w:tcBorders>
+              <w:top w:val="single" w:color="D0D5DD" w:sz="4"/>
+              <w:left w:val="single" w:color="D0D5DD" w:sz="4"/>
+              <w:bottom w:val="single" w:color="D0D5DD" w:sz="4"/>
+              <w:right w:val="single" w:color="D0D5DD" w:sz="4"/>
+            </w:tcBorders>
+            <w:tcMar>
+              <w:top w:type="dxa" w:w="60"/>
+              <w:left w:type="dxa" w:w="100"/>
+              <w:bottom w:type="dxa" w:w="60"/>
+              <w:right w:type="dxa" w:w="100"/>
+            </w:tcMar>
+          </w:tcPr>
+          <w:p>
+            <w:r>
+              <w:rPr>
+                <w:b w:val="false"/>
+                <w:bCs w:val="false"/>
+                <w:sz w:val="18"/>
+                <w:szCs w:val="18"/>
+              </w:rPr>
+              <w:t xml:space="preserve">2026-10-29 09:52</w:t>
+            </w:r>
+          </w:p>
+        </w:tc>
+        <w:tc>
+          <w:tcPr>
+            <w:tcW w:type="dxa" w:w="6638"/>
+            <w:tcBorders>
+              <w:top w:val="single" w:color="D0D5DD" w:sz="4"/>
+              <w:left w:val="single" w:color="D0D5DD" w:sz="4"/>
+              <w:bottom w:val="single" w:color="D0D5DD" w:sz="4"/>
+              <w:right w:val="single" w:color="D0D5DD" w:sz="4"/>
+            </w:tcBorders>
+            <w:tcMar>
+              <w:top w:type="dxa" w:w="60"/>
+              <w:left w:type="dxa" w:w="100"/>
+              <w:bottom w:type="dxa" w:w="60"/>
+              <w:right w:type="dxa" w:w="100"/>
+            </w:tcMar>
+          </w:tcPr>
+          <w:p>
+            <w:r>
+              <w:rPr>
+                <w:b w:val="false"/>
+                <w:bCs w:val="false"/>
+                <w:sz w:val="18"/>
+                <w:szCs w:val="18"/>
+              </w:rPr>
+              <w:t xml:space="preserve">Adendo ao plano v1.1: diagnóstico da especificação S2, antes de rodar</w:t>
+            </w:r>
+          </w:p>
+        </w:tc>
+      </w:tr>
+      <w:tr>
+        <w:tc>
+          <w:tcPr>
+            <w:tcW w:type="dxa" w:w="1100"/>
+            <w:tcBorders>
+              <w:top w:val="single" w:color="D0D5DD" w:sz="4"/>
+              <w:left w:val="single" w:color="D0D5DD" w:sz="4"/>
+              <w:bottom w:val="single" w:color="D0D5DD" w:sz="4"/>
+              <w:right w:val="single" w:color="D0D5DD" w:sz="4"/>
+            </w:tcBorders>
+            <w:tcMar>
+              <w:top w:type="dxa" w:w="60"/>
+              <w:left w:type="dxa" w:w="100"/>
+              <w:bottom w:type="dxa" w:w="60"/>
+              <w:right w:type="dxa" w:w="100"/>
+            </w:tcMar>
+          </w:tcPr>
+          <w:p>
+            <w:hyperlink w:history="1" r:id="rId-yab6demclez8o0kcyang">
+              <w:r>
+                <w:rPr>
+                  <w:rStyle w:val="Hyperlink"/>
+                </w:rPr>
+                <w:t xml:space="preserve">a4fed17</w:t>
+              </w:r>
+            </w:hyperlink>
+          </w:p>
+        </w:tc>
+        <w:tc>
+          <w:tcPr>
+            <w:tcW w:type="dxa" w:w="1900"/>
+            <w:tcBorders>
+              <w:top w:val="single" w:color="D0D5DD" w:sz="4"/>
+              <w:left w:val="single" w:color="D0D5DD" w:sz="4"/>
+              <w:bottom w:val="single" w:color="D0D5DD" w:sz="4"/>
+              <w:right w:val="single" w:color="D0D5DD" w:sz="4"/>
+            </w:tcBorders>
+            <w:tcMar>
+              <w:top w:type="dxa" w:w="60"/>
+              <w:left w:type="dxa" w:w="100"/>
+              <w:bottom w:type="dxa" w:w="60"/>
+              <w:right w:type="dxa" w:w="100"/>
+            </w:tcMar>
+          </w:tcPr>
+          <w:p>
+            <w:r>
+              <w:rPr>
+                <w:b w:val="false"/>
+                <w:bCs w:val="false"/>
+                <w:sz w:val="18"/>
+                <w:szCs w:val="18"/>
+              </w:rPr>
+              <w:t xml:space="preserve">2026-10-29 09:52</w:t>
+            </w:r>
+          </w:p>
+        </w:tc>
+        <w:tc>
+          <w:tcPr>
+            <w:tcW w:type="dxa" w:w="6638"/>
+            <w:tcBorders>
+              <w:top w:val="single" w:color="D0D5DD" w:sz="4"/>
+              <w:left w:val="single" w:color="D0D5DD" w:sz="4"/>
+              <w:bottom w:val="single" w:color="D0D5DD" w:sz="4"/>
+              <w:right w:val="single" w:color="D0D5DD" w:sz="4"/>
+            </w:tcBorders>
+            <w:tcMar>
+              <w:top w:type="dxa" w:w="60"/>
+              <w:left w:type="dxa" w:w="100"/>
+              <w:bottom w:type="dxa" w:w="60"/>
+              <w:right w:type="dxa" w:w="100"/>
+            </w:tcMar>
+          </w:tcPr>
+          <w:p>
+            <w:r>
+              <w:rPr>
+                <w:b w:val="false"/>
+                <w:bCs w:val="false"/>
+                <w:sz w:val="18"/>
+                <w:szCs w:val="18"/>
+              </w:rPr>
+              <w:t xml:space="preserve">Carimbo OpenTimestamps do adendo v1.1</w:t>
             </w:r>
           </w:p>
         </w:tc>
@@ -3959,7 +4620,7 @@
         <w:spacing w:after="140" w:line="300"/>
       </w:pPr>
       <w:r>
-        <w:t xml:space="preserve">O universo tem 517.179 seções. Como o pacote completo de boletins assinados soma dezenas de gigabytes (só o de São Paulo tem cerca de 26 GB), o plano previa uma amostra aleatória de pelo menos 5 mil urnas, estratificada por estado e porte de município. Foram sorteadas 6.025 seções, com semente aleatória registrada antes do sorteio. Delas, 205 eram seções agregadas (votam na urna de outra seção) e 128 não tinham boletim marcado como totalizado no dia da coleta.</w:t>
+        <w:t xml:space="preserve">O universo tem 517.179 seções. Como o pacote completo de boletins assinados soma dezenas de gigabytes (só o de São Paulo tem cerca de 26 GB), o plano previa uma amostra aleatória de pelo menos 5 mil urnas, estratificada por estado e porte de município. Foram sorteadas 6.025 seções, com semente aleatória registrada antes do sorteio. Delas, 205 eram seções agregadas (votam na urna de outra seção) e 128 não tinham boletim marcado como totalizado no dia da coleta (127 com boletim em estado "Recebido", verificados à parte, e 1 urna não instalada). Em nenhuma das 205 agregadas a seção principal foi sorteada (0), então os votos delas estão em boletins que não foram verificados.</w:t>
       </w:r>
     </w:p>
     <w:tbl>
@@ -4392,7 +5053,7 @@
               <w:t xml:space="preserve">O que isso significa. </w:t>
             </w:r>
             <w:r>
-              <w:t xml:space="preserve">Pelo critério fixado antes, a hipótese de fraude na contagem fica rejeitada no escopo amostrado. Como é uma amostra, o resultado é compatível com, no máximo, 0,065% de urnas divergentes no país inteiro (limite superior do intervalo de 95% de confiança). O teste não autoriza afirmar nada sobre uma urna específica que não foi sorteada.</w:t>
+              <w:t xml:space="preserve">Pelo critério fixado antes, a hipótese de fraude na contagem fica rejeitada no escopo amostrado. Como é uma amostra, o resultado é compatível com, no máximo, 0,0648% de urnas divergentes no país inteiro. A conta: com zero divergências em n = 5.692 urnas, o limite superior do intervalo exato de Clopper-Pearson de 95% é 1 − 0,025^(1/n); levando em conta os pesos da amostra estratificada (tamanho efetivo de 5.676), fica em 0,0650%. O teste não autoriza afirmar nada sobre uma urna específica que não foi sorteada. E há um limite de escopo: a reconciliação mostra que o boletim e a totalização coincidem, não que a urna registrou exatamente a intenção de cada eleitor; essa é outra questão, que este teste não cobre.</w:t>
             </w:r>
           </w:p>
         </w:tc>
@@ -4438,6 +5099,14 @@
       </w:pPr>
       <w:r>
         <w:t xml:space="preserve">A busca por aglomerados locais, com correção para as milhares de comparações simultâneas, não encontrou nenhum município em aglomerado em 2026. Numa versão mais sensível do teste (9.999 sorteios em vez de 999), as eleições de 2014 e 2022 mostraram 10 e 10 municípios em aglomerado, e 2026 continuou com 0. Pelo critério do plano: nada anômalo.</w:t>
+      </w:r>
+    </w:p>
+    <w:p>
+      <w:pPr>
+        <w:spacing w:after="140" w:line="300"/>
+      </w:pPr>
+      <w:r>
+        <w:t xml:space="preserve">O modelo usa dados do Censo 2022 também para 2014 e 2018, o que poderia distorcer a comparação. Para testar isso (análise exploratória da revisão 1.1), o modelo foi refeito só com os resultados do 1º turno, sem nenhum dado do Censo. O I de Moran ficou em 0,300 (2014), 0,211 (2018), 0,197 (2022) e 0,251 (2026), de novo dentro da faixa; 2026 teve 0 municípios em aglomerado, contra 14 em 2014 e 20 em 2022. A conclusão não depende do Censo.</w:t>
       </w:r>
     </w:p>
     <w:p>
@@ -4494,6 +5163,857 @@
       </w:pPr>
       <w:r>
         <w:t xml:space="preserve">quando o modelo pondera pelo tamanho da seção (análise exploratória), sobram 52 seções, e o único agrupamento é um mesmo local de votação em São Paulo.</w:t>
+      </w:r>
+    </w:p>
+    <w:p>
+      <w:pPr>
+        <w:spacing w:after="140" w:line="300"/>
+      </w:pPr>
+      <w:r>
+        <w:t xml:space="preserve">Quanto menor a seção, maior a chance de ela aparecer como atípica:</w:t>
+      </w:r>
+    </w:p>
+    <w:tbl>
+      <w:tblPr>
+        <w:tblW w:type="dxa" w:w="9638"/>
+        <w:tblBorders>
+          <w:top w:val="single" w:color="auto" w:sz="4"/>
+          <w:left w:val="single" w:color="auto" w:sz="4"/>
+          <w:bottom w:val="single" w:color="auto" w:sz="4"/>
+          <w:right w:val="single" w:color="auto" w:sz="4"/>
+          <w:insideH w:val="single" w:color="auto" w:sz="4"/>
+          <w:insideV w:val="single" w:color="auto" w:sz="4"/>
+        </w:tblBorders>
+      </w:tblPr>
+      <w:tblGrid>
+        <w:gridCol w:w="2900"/>
+        <w:gridCol w:w="2300"/>
+        <w:gridCol w:w="2200"/>
+        <w:gridCol w:w="2238"/>
+      </w:tblGrid>
+      <w:tr>
+        <w:trPr>
+          <w:tblHeader/>
+        </w:trPr>
+        <w:tc>
+          <w:tcPr>
+            <w:tcW w:type="dxa" w:w="2900"/>
+            <w:tcBorders>
+              <w:top w:val="single" w:color="D0D5DD" w:sz="4"/>
+              <w:left w:val="single" w:color="D0D5DD" w:sz="4"/>
+              <w:bottom w:val="single" w:color="D0D5DD" w:sz="4"/>
+              <w:right w:val="single" w:color="D0D5DD" w:sz="4"/>
+            </w:tcBorders>
+            <w:shd w:fill="1F4E79" w:color="auto" w:val="clear"/>
+            <w:tcMar>
+              <w:top w:type="dxa" w:w="60"/>
+              <w:left w:type="dxa" w:w="100"/>
+              <w:bottom w:type="dxa" w:w="60"/>
+              <w:right w:type="dxa" w:w="100"/>
+            </w:tcMar>
+          </w:tcPr>
+          <w:p>
+            <w:r>
+              <w:rPr>
+                <w:b/>
+                <w:bCs/>
+                <w:color w:val="FFFFFF"/>
+                <w:sz w:val="18"/>
+                <w:szCs w:val="18"/>
+              </w:rPr>
+              <w:t xml:space="preserve">Votos na seção (2º turno)</w:t>
+            </w:r>
+          </w:p>
+        </w:tc>
+        <w:tc>
+          <w:tcPr>
+            <w:tcW w:type="dxa" w:w="2300"/>
+            <w:tcBorders>
+              <w:top w:val="single" w:color="D0D5DD" w:sz="4"/>
+              <w:left w:val="single" w:color="D0D5DD" w:sz="4"/>
+              <w:bottom w:val="single" w:color="D0D5DD" w:sz="4"/>
+              <w:right w:val="single" w:color="D0D5DD" w:sz="4"/>
+            </w:tcBorders>
+            <w:shd w:fill="1F4E79" w:color="auto" w:val="clear"/>
+            <w:tcMar>
+              <w:top w:type="dxa" w:w="60"/>
+              <w:left w:type="dxa" w:w="100"/>
+              <w:bottom w:type="dxa" w:w="60"/>
+              <w:right w:type="dxa" w:w="100"/>
+            </w:tcMar>
+          </w:tcPr>
+          <w:p>
+            <w:r>
+              <w:rPr>
+                <w:b/>
+                <w:bCs/>
+                <w:color w:val="FFFFFF"/>
+                <w:sz w:val="18"/>
+                <w:szCs w:val="18"/>
+              </w:rPr>
+              <w:t xml:space="preserve">Seções no país</w:t>
+            </w:r>
+          </w:p>
+        </w:tc>
+        <w:tc>
+          <w:tcPr>
+            <w:tcW w:type="dxa" w:w="2200"/>
+            <w:tcBorders>
+              <w:top w:val="single" w:color="D0D5DD" w:sz="4"/>
+              <w:left w:val="single" w:color="D0D5DD" w:sz="4"/>
+              <w:bottom w:val="single" w:color="D0D5DD" w:sz="4"/>
+              <w:right w:val="single" w:color="D0D5DD" w:sz="4"/>
+            </w:tcBorders>
+            <w:shd w:fill="1F4E79" w:color="auto" w:val="clear"/>
+            <w:tcMar>
+              <w:top w:type="dxa" w:w="60"/>
+              <w:left w:type="dxa" w:w="100"/>
+              <w:bottom w:type="dxa" w:w="60"/>
+              <w:right w:type="dxa" w:w="100"/>
+            </w:tcMar>
+          </w:tcPr>
+          <w:p>
+            <w:r>
+              <w:rPr>
+                <w:b/>
+                <w:bCs/>
+                <w:color w:val="FFFFFF"/>
+                <w:sz w:val="18"/>
+                <w:szCs w:val="18"/>
+              </w:rPr>
+              <w:t xml:space="preserve">Seções atípicas</w:t>
+            </w:r>
+          </w:p>
+        </w:tc>
+        <w:tc>
+          <w:tcPr>
+            <w:tcW w:type="dxa" w:w="2238"/>
+            <w:tcBorders>
+              <w:top w:val="single" w:color="D0D5DD" w:sz="4"/>
+              <w:left w:val="single" w:color="D0D5DD" w:sz="4"/>
+              <w:bottom w:val="single" w:color="D0D5DD" w:sz="4"/>
+              <w:right w:val="single" w:color="D0D5DD" w:sz="4"/>
+            </w:tcBorders>
+            <w:shd w:fill="1F4E79" w:color="auto" w:val="clear"/>
+            <w:tcMar>
+              <w:top w:type="dxa" w:w="60"/>
+              <w:left w:type="dxa" w:w="100"/>
+              <w:bottom w:type="dxa" w:w="60"/>
+              <w:right w:type="dxa" w:w="100"/>
+            </w:tcMar>
+          </w:tcPr>
+          <w:p>
+            <w:r>
+              <w:rPr>
+                <w:b/>
+                <w:bCs/>
+                <w:color w:val="FFFFFF"/>
+                <w:sz w:val="18"/>
+                <w:szCs w:val="18"/>
+              </w:rPr>
+              <w:t xml:space="preserve">% atípicas na faixa</w:t>
+            </w:r>
+          </w:p>
+        </w:tc>
+      </w:tr>
+      <w:tr>
+        <w:tc>
+          <w:tcPr>
+            <w:tcW w:type="dxa" w:w="2900"/>
+            <w:tcBorders>
+              <w:top w:val="single" w:color="D0D5DD" w:sz="4"/>
+              <w:left w:val="single" w:color="D0D5DD" w:sz="4"/>
+              <w:bottom w:val="single" w:color="D0D5DD" w:sz="4"/>
+              <w:right w:val="single" w:color="D0D5DD" w:sz="4"/>
+            </w:tcBorders>
+            <w:tcMar>
+              <w:top w:type="dxa" w:w="60"/>
+              <w:left w:type="dxa" w:w="100"/>
+              <w:bottom w:type="dxa" w:w="60"/>
+              <w:right w:type="dxa" w:w="100"/>
+            </w:tcMar>
+          </w:tcPr>
+          <w:p>
+            <w:r>
+              <w:rPr>
+                <w:b w:val="false"/>
+                <w:bCs w:val="false"/>
+                <w:sz w:val="18"/>
+                <w:szCs w:val="18"/>
+              </w:rPr>
+              <w:t xml:space="preserve">até 100</w:t>
+            </w:r>
+          </w:p>
+        </w:tc>
+        <w:tc>
+          <w:tcPr>
+            <w:tcW w:type="dxa" w:w="2300"/>
+            <w:tcBorders>
+              <w:top w:val="single" w:color="D0D5DD" w:sz="4"/>
+              <w:left w:val="single" w:color="D0D5DD" w:sz="4"/>
+              <w:bottom w:val="single" w:color="D0D5DD" w:sz="4"/>
+              <w:right w:val="single" w:color="D0D5DD" w:sz="4"/>
+            </w:tcBorders>
+            <w:tcMar>
+              <w:top w:type="dxa" w:w="60"/>
+              <w:left w:type="dxa" w:w="100"/>
+              <w:bottom w:type="dxa" w:w="60"/>
+              <w:right w:type="dxa" w:w="100"/>
+            </w:tcMar>
+          </w:tcPr>
+          <w:p>
+            <w:r>
+              <w:rPr>
+                <w:b w:val="false"/>
+                <w:bCs w:val="false"/>
+                <w:sz w:val="18"/>
+                <w:szCs w:val="18"/>
+              </w:rPr>
+              <w:t xml:space="preserve">5.467</w:t>
+            </w:r>
+          </w:p>
+        </w:tc>
+        <w:tc>
+          <w:tcPr>
+            <w:tcW w:type="dxa" w:w="2200"/>
+            <w:tcBorders>
+              <w:top w:val="single" w:color="D0D5DD" w:sz="4"/>
+              <w:left w:val="single" w:color="D0D5DD" w:sz="4"/>
+              <w:bottom w:val="single" w:color="D0D5DD" w:sz="4"/>
+              <w:right w:val="single" w:color="D0D5DD" w:sz="4"/>
+            </w:tcBorders>
+            <w:tcMar>
+              <w:top w:type="dxa" w:w="60"/>
+              <w:left w:type="dxa" w:w="100"/>
+              <w:bottom w:type="dxa" w:w="60"/>
+              <w:right w:type="dxa" w:w="100"/>
+            </w:tcMar>
+          </w:tcPr>
+          <w:p>
+            <w:r>
+              <w:rPr>
+                <w:b w:val="false"/>
+                <w:bCs w:val="false"/>
+                <w:sz w:val="18"/>
+                <w:szCs w:val="18"/>
+              </w:rPr>
+              <w:t xml:space="preserve">209</w:t>
+            </w:r>
+          </w:p>
+        </w:tc>
+        <w:tc>
+          <w:tcPr>
+            <w:tcW w:type="dxa" w:w="2238"/>
+            <w:tcBorders>
+              <w:top w:val="single" w:color="D0D5DD" w:sz="4"/>
+              <w:left w:val="single" w:color="D0D5DD" w:sz="4"/>
+              <w:bottom w:val="single" w:color="D0D5DD" w:sz="4"/>
+              <w:right w:val="single" w:color="D0D5DD" w:sz="4"/>
+            </w:tcBorders>
+            <w:tcMar>
+              <w:top w:type="dxa" w:w="60"/>
+              <w:left w:type="dxa" w:w="100"/>
+              <w:bottom w:type="dxa" w:w="60"/>
+              <w:right w:type="dxa" w:w="100"/>
+            </w:tcMar>
+          </w:tcPr>
+          <w:p>
+            <w:r>
+              <w:rPr>
+                <w:b w:val="false"/>
+                <w:bCs w:val="false"/>
+                <w:sz w:val="18"/>
+                <w:szCs w:val="18"/>
+              </w:rPr>
+              <w:t xml:space="preserve">3,82</w:t>
+            </w:r>
+          </w:p>
+        </w:tc>
+      </w:tr>
+      <w:tr>
+        <w:tc>
+          <w:tcPr>
+            <w:tcW w:type="dxa" w:w="2900"/>
+            <w:tcBorders>
+              <w:top w:val="single" w:color="D0D5DD" w:sz="4"/>
+              <w:left w:val="single" w:color="D0D5DD" w:sz="4"/>
+              <w:bottom w:val="single" w:color="D0D5DD" w:sz="4"/>
+              <w:right w:val="single" w:color="D0D5DD" w:sz="4"/>
+            </w:tcBorders>
+            <w:tcMar>
+              <w:top w:type="dxa" w:w="60"/>
+              <w:left w:type="dxa" w:w="100"/>
+              <w:bottom w:type="dxa" w:w="60"/>
+              <w:right w:type="dxa" w:w="100"/>
+            </w:tcMar>
+          </w:tcPr>
+          <w:p>
+            <w:r>
+              <w:rPr>
+                <w:b w:val="false"/>
+                <w:bCs w:val="false"/>
+                <w:sz w:val="18"/>
+                <w:szCs w:val="18"/>
+              </w:rPr>
+              <w:t xml:space="preserve">101–150</w:t>
+            </w:r>
+          </w:p>
+        </w:tc>
+        <w:tc>
+          <w:tcPr>
+            <w:tcW w:type="dxa" w:w="2300"/>
+            <w:tcBorders>
+              <w:top w:val="single" w:color="D0D5DD" w:sz="4"/>
+              <w:left w:val="single" w:color="D0D5DD" w:sz="4"/>
+              <w:bottom w:val="single" w:color="D0D5DD" w:sz="4"/>
+              <w:right w:val="single" w:color="D0D5DD" w:sz="4"/>
+            </w:tcBorders>
+            <w:tcMar>
+              <w:top w:type="dxa" w:w="60"/>
+              <w:left w:type="dxa" w:w="100"/>
+              <w:bottom w:type="dxa" w:w="60"/>
+              <w:right w:type="dxa" w:w="100"/>
+            </w:tcMar>
+          </w:tcPr>
+          <w:p>
+            <w:r>
+              <w:rPr>
+                <w:b w:val="false"/>
+                <w:bCs w:val="false"/>
+                <w:sz w:val="18"/>
+                <w:szCs w:val="18"/>
+              </w:rPr>
+              <w:t xml:space="preserve">15.344</w:t>
+            </w:r>
+          </w:p>
+        </w:tc>
+        <w:tc>
+          <w:tcPr>
+            <w:tcW w:type="dxa" w:w="2200"/>
+            <w:tcBorders>
+              <w:top w:val="single" w:color="D0D5DD" w:sz="4"/>
+              <w:left w:val="single" w:color="D0D5DD" w:sz="4"/>
+              <w:bottom w:val="single" w:color="D0D5DD" w:sz="4"/>
+              <w:right w:val="single" w:color="D0D5DD" w:sz="4"/>
+            </w:tcBorders>
+            <w:tcMar>
+              <w:top w:type="dxa" w:w="60"/>
+              <w:left w:type="dxa" w:w="100"/>
+              <w:bottom w:type="dxa" w:w="60"/>
+              <w:right w:type="dxa" w:w="100"/>
+            </w:tcMar>
+          </w:tcPr>
+          <w:p>
+            <w:r>
+              <w:rPr>
+                <w:b w:val="false"/>
+                <w:bCs w:val="false"/>
+                <w:sz w:val="18"/>
+                <w:szCs w:val="18"/>
+              </w:rPr>
+              <w:t xml:space="preserve">113</w:t>
+            </w:r>
+          </w:p>
+        </w:tc>
+        <w:tc>
+          <w:tcPr>
+            <w:tcW w:type="dxa" w:w="2238"/>
+            <w:tcBorders>
+              <w:top w:val="single" w:color="D0D5DD" w:sz="4"/>
+              <w:left w:val="single" w:color="D0D5DD" w:sz="4"/>
+              <w:bottom w:val="single" w:color="D0D5DD" w:sz="4"/>
+              <w:right w:val="single" w:color="D0D5DD" w:sz="4"/>
+            </w:tcBorders>
+            <w:tcMar>
+              <w:top w:type="dxa" w:w="60"/>
+              <w:left w:type="dxa" w:w="100"/>
+              <w:bottom w:type="dxa" w:w="60"/>
+              <w:right w:type="dxa" w:w="100"/>
+            </w:tcMar>
+          </w:tcPr>
+          <w:p>
+            <w:r>
+              <w:rPr>
+                <w:b w:val="false"/>
+                <w:bCs w:val="false"/>
+                <w:sz w:val="18"/>
+                <w:szCs w:val="18"/>
+              </w:rPr>
+              <w:t xml:space="preserve">0,74</w:t>
+            </w:r>
+          </w:p>
+        </w:tc>
+      </w:tr>
+      <w:tr>
+        <w:tc>
+          <w:tcPr>
+            <w:tcW w:type="dxa" w:w="2900"/>
+            <w:tcBorders>
+              <w:top w:val="single" w:color="D0D5DD" w:sz="4"/>
+              <w:left w:val="single" w:color="D0D5DD" w:sz="4"/>
+              <w:bottom w:val="single" w:color="D0D5DD" w:sz="4"/>
+              <w:right w:val="single" w:color="D0D5DD" w:sz="4"/>
+            </w:tcBorders>
+            <w:tcMar>
+              <w:top w:type="dxa" w:w="60"/>
+              <w:left w:type="dxa" w:w="100"/>
+              <w:bottom w:type="dxa" w:w="60"/>
+              <w:right w:type="dxa" w:w="100"/>
+            </w:tcMar>
+          </w:tcPr>
+          <w:p>
+            <w:r>
+              <w:rPr>
+                <w:b w:val="false"/>
+                <w:bCs w:val="false"/>
+                <w:sz w:val="18"/>
+                <w:szCs w:val="18"/>
+              </w:rPr>
+              <w:t xml:space="preserve">151–200</w:t>
+            </w:r>
+          </w:p>
+        </w:tc>
+        <w:tc>
+          <w:tcPr>
+            <w:tcW w:type="dxa" w:w="2300"/>
+            <w:tcBorders>
+              <w:top w:val="single" w:color="D0D5DD" w:sz="4"/>
+              <w:left w:val="single" w:color="D0D5DD" w:sz="4"/>
+              <w:bottom w:val="single" w:color="D0D5DD" w:sz="4"/>
+              <w:right w:val="single" w:color="D0D5DD" w:sz="4"/>
+            </w:tcBorders>
+            <w:tcMar>
+              <w:top w:type="dxa" w:w="60"/>
+              <w:left w:type="dxa" w:w="100"/>
+              <w:bottom w:type="dxa" w:w="60"/>
+              <w:right w:type="dxa" w:w="100"/>
+            </w:tcMar>
+          </w:tcPr>
+          <w:p>
+            <w:r>
+              <w:rPr>
+                <w:b w:val="false"/>
+                <w:bCs w:val="false"/>
+                <w:sz w:val="18"/>
+                <w:szCs w:val="18"/>
+              </w:rPr>
+              <w:t xml:space="preserve">64.605</w:t>
+            </w:r>
+          </w:p>
+        </w:tc>
+        <w:tc>
+          <w:tcPr>
+            <w:tcW w:type="dxa" w:w="2200"/>
+            <w:tcBorders>
+              <w:top w:val="single" w:color="D0D5DD" w:sz="4"/>
+              <w:left w:val="single" w:color="D0D5DD" w:sz="4"/>
+              <w:bottom w:val="single" w:color="D0D5DD" w:sz="4"/>
+              <w:right w:val="single" w:color="D0D5DD" w:sz="4"/>
+            </w:tcBorders>
+            <w:tcMar>
+              <w:top w:type="dxa" w:w="60"/>
+              <w:left w:type="dxa" w:w="100"/>
+              <w:bottom w:type="dxa" w:w="60"/>
+              <w:right w:type="dxa" w:w="100"/>
+            </w:tcMar>
+          </w:tcPr>
+          <w:p>
+            <w:r>
+              <w:rPr>
+                <w:b w:val="false"/>
+                <w:bCs w:val="false"/>
+                <w:sz w:val="18"/>
+                <w:szCs w:val="18"/>
+              </w:rPr>
+              <w:t xml:space="preserve">78</w:t>
+            </w:r>
+          </w:p>
+        </w:tc>
+        <w:tc>
+          <w:tcPr>
+            <w:tcW w:type="dxa" w:w="2238"/>
+            <w:tcBorders>
+              <w:top w:val="single" w:color="D0D5DD" w:sz="4"/>
+              <w:left w:val="single" w:color="D0D5DD" w:sz="4"/>
+              <w:bottom w:val="single" w:color="D0D5DD" w:sz="4"/>
+              <w:right w:val="single" w:color="D0D5DD" w:sz="4"/>
+            </w:tcBorders>
+            <w:tcMar>
+              <w:top w:type="dxa" w:w="60"/>
+              <w:left w:type="dxa" w:w="100"/>
+              <w:bottom w:type="dxa" w:w="60"/>
+              <w:right w:type="dxa" w:w="100"/>
+            </w:tcMar>
+          </w:tcPr>
+          <w:p>
+            <w:r>
+              <w:rPr>
+                <w:b w:val="false"/>
+                <w:bCs w:val="false"/>
+                <w:sz w:val="18"/>
+                <w:szCs w:val="18"/>
+              </w:rPr>
+              <w:t xml:space="preserve">0,12</w:t>
+            </w:r>
+          </w:p>
+        </w:tc>
+      </w:tr>
+      <w:tr>
+        <w:tc>
+          <w:tcPr>
+            <w:tcW w:type="dxa" w:w="2900"/>
+            <w:tcBorders>
+              <w:top w:val="single" w:color="D0D5DD" w:sz="4"/>
+              <w:left w:val="single" w:color="D0D5DD" w:sz="4"/>
+              <w:bottom w:val="single" w:color="D0D5DD" w:sz="4"/>
+              <w:right w:val="single" w:color="D0D5DD" w:sz="4"/>
+            </w:tcBorders>
+            <w:tcMar>
+              <w:top w:type="dxa" w:w="60"/>
+              <w:left w:type="dxa" w:w="100"/>
+              <w:bottom w:type="dxa" w:w="60"/>
+              <w:right w:type="dxa" w:w="100"/>
+            </w:tcMar>
+          </w:tcPr>
+          <w:p>
+            <w:r>
+              <w:rPr>
+                <w:b w:val="false"/>
+                <w:bCs w:val="false"/>
+                <w:sz w:val="18"/>
+                <w:szCs w:val="18"/>
+              </w:rPr>
+              <w:t xml:space="preserve">201–250</w:t>
+            </w:r>
+          </w:p>
+        </w:tc>
+        <w:tc>
+          <w:tcPr>
+            <w:tcW w:type="dxa" w:w="2300"/>
+            <w:tcBorders>
+              <w:top w:val="single" w:color="D0D5DD" w:sz="4"/>
+              <w:left w:val="single" w:color="D0D5DD" w:sz="4"/>
+              <w:bottom w:val="single" w:color="D0D5DD" w:sz="4"/>
+              <w:right w:val="single" w:color="D0D5DD" w:sz="4"/>
+            </w:tcBorders>
+            <w:tcMar>
+              <w:top w:type="dxa" w:w="60"/>
+              <w:left w:type="dxa" w:w="100"/>
+              <w:bottom w:type="dxa" w:w="60"/>
+              <w:right w:type="dxa" w:w="100"/>
+            </w:tcMar>
+          </w:tcPr>
+          <w:p>
+            <w:r>
+              <w:rPr>
+                <w:b w:val="false"/>
+                <w:bCs w:val="false"/>
+                <w:sz w:val="18"/>
+                <w:szCs w:val="18"/>
+              </w:rPr>
+              <w:t xml:space="preserve">147.623</w:t>
+            </w:r>
+          </w:p>
+        </w:tc>
+        <w:tc>
+          <w:tcPr>
+            <w:tcW w:type="dxa" w:w="2200"/>
+            <w:tcBorders>
+              <w:top w:val="single" w:color="D0D5DD" w:sz="4"/>
+              <w:left w:val="single" w:color="D0D5DD" w:sz="4"/>
+              <w:bottom w:val="single" w:color="D0D5DD" w:sz="4"/>
+              <w:right w:val="single" w:color="D0D5DD" w:sz="4"/>
+            </w:tcBorders>
+            <w:tcMar>
+              <w:top w:type="dxa" w:w="60"/>
+              <w:left w:type="dxa" w:w="100"/>
+              <w:bottom w:type="dxa" w:w="60"/>
+              <w:right w:type="dxa" w:w="100"/>
+            </w:tcMar>
+          </w:tcPr>
+          <w:p>
+            <w:r>
+              <w:rPr>
+                <w:b w:val="false"/>
+                <w:bCs w:val="false"/>
+                <w:sz w:val="18"/>
+                <w:szCs w:val="18"/>
+              </w:rPr>
+              <w:t xml:space="preserve">41</w:t>
+            </w:r>
+          </w:p>
+        </w:tc>
+        <w:tc>
+          <w:tcPr>
+            <w:tcW w:type="dxa" w:w="2238"/>
+            <w:tcBorders>
+              <w:top w:val="single" w:color="D0D5DD" w:sz="4"/>
+              <w:left w:val="single" w:color="D0D5DD" w:sz="4"/>
+              <w:bottom w:val="single" w:color="D0D5DD" w:sz="4"/>
+              <w:right w:val="single" w:color="D0D5DD" w:sz="4"/>
+            </w:tcBorders>
+            <w:tcMar>
+              <w:top w:type="dxa" w:w="60"/>
+              <w:left w:type="dxa" w:w="100"/>
+              <w:bottom w:type="dxa" w:w="60"/>
+              <w:right w:type="dxa" w:w="100"/>
+            </w:tcMar>
+          </w:tcPr>
+          <w:p>
+            <w:r>
+              <w:rPr>
+                <w:b w:val="false"/>
+                <w:bCs w:val="false"/>
+                <w:sz w:val="18"/>
+                <w:szCs w:val="18"/>
+              </w:rPr>
+              <w:t xml:space="preserve">0,03</w:t>
+            </w:r>
+          </w:p>
+        </w:tc>
+      </w:tr>
+      <w:tr>
+        <w:tc>
+          <w:tcPr>
+            <w:tcW w:type="dxa" w:w="2900"/>
+            <w:tcBorders>
+              <w:top w:val="single" w:color="D0D5DD" w:sz="4"/>
+              <w:left w:val="single" w:color="D0D5DD" w:sz="4"/>
+              <w:bottom w:val="single" w:color="D0D5DD" w:sz="4"/>
+              <w:right w:val="single" w:color="D0D5DD" w:sz="4"/>
+            </w:tcBorders>
+            <w:tcMar>
+              <w:top w:type="dxa" w:w="60"/>
+              <w:left w:type="dxa" w:w="100"/>
+              <w:bottom w:type="dxa" w:w="60"/>
+              <w:right w:type="dxa" w:w="100"/>
+            </w:tcMar>
+          </w:tcPr>
+          <w:p>
+            <w:r>
+              <w:rPr>
+                <w:b w:val="false"/>
+                <w:bCs w:val="false"/>
+                <w:sz w:val="18"/>
+                <w:szCs w:val="18"/>
+              </w:rPr>
+              <w:t xml:space="preserve">251–300</w:t>
+            </w:r>
+          </w:p>
+        </w:tc>
+        <w:tc>
+          <w:tcPr>
+            <w:tcW w:type="dxa" w:w="2300"/>
+            <w:tcBorders>
+              <w:top w:val="single" w:color="D0D5DD" w:sz="4"/>
+              <w:left w:val="single" w:color="D0D5DD" w:sz="4"/>
+              <w:bottom w:val="single" w:color="D0D5DD" w:sz="4"/>
+              <w:right w:val="single" w:color="D0D5DD" w:sz="4"/>
+            </w:tcBorders>
+            <w:tcMar>
+              <w:top w:type="dxa" w:w="60"/>
+              <w:left w:type="dxa" w:w="100"/>
+              <w:bottom w:type="dxa" w:w="60"/>
+              <w:right w:type="dxa" w:w="100"/>
+            </w:tcMar>
+          </w:tcPr>
+          <w:p>
+            <w:r>
+              <w:rPr>
+                <w:b w:val="false"/>
+                <w:bCs w:val="false"/>
+                <w:sz w:val="18"/>
+                <w:szCs w:val="18"/>
+              </w:rPr>
+              <w:t xml:space="preserve">193.691</w:t>
+            </w:r>
+          </w:p>
+        </w:tc>
+        <w:tc>
+          <w:tcPr>
+            <w:tcW w:type="dxa" w:w="2200"/>
+            <w:tcBorders>
+              <w:top w:val="single" w:color="D0D5DD" w:sz="4"/>
+              <w:left w:val="single" w:color="D0D5DD" w:sz="4"/>
+              <w:bottom w:val="single" w:color="D0D5DD" w:sz="4"/>
+              <w:right w:val="single" w:color="D0D5DD" w:sz="4"/>
+            </w:tcBorders>
+            <w:tcMar>
+              <w:top w:type="dxa" w:w="60"/>
+              <w:left w:type="dxa" w:w="100"/>
+              <w:bottom w:type="dxa" w:w="60"/>
+              <w:right w:type="dxa" w:w="100"/>
+            </w:tcMar>
+          </w:tcPr>
+          <w:p>
+            <w:r>
+              <w:rPr>
+                <w:b w:val="false"/>
+                <w:bCs w:val="false"/>
+                <w:sz w:val="18"/>
+                <w:szCs w:val="18"/>
+              </w:rPr>
+              <w:t xml:space="preserve">16</w:t>
+            </w:r>
+          </w:p>
+        </w:tc>
+        <w:tc>
+          <w:tcPr>
+            <w:tcW w:type="dxa" w:w="2238"/>
+            <w:tcBorders>
+              <w:top w:val="single" w:color="D0D5DD" w:sz="4"/>
+              <w:left w:val="single" w:color="D0D5DD" w:sz="4"/>
+              <w:bottom w:val="single" w:color="D0D5DD" w:sz="4"/>
+              <w:right w:val="single" w:color="D0D5DD" w:sz="4"/>
+            </w:tcBorders>
+            <w:tcMar>
+              <w:top w:type="dxa" w:w="60"/>
+              <w:left w:type="dxa" w:w="100"/>
+              <w:bottom w:type="dxa" w:w="60"/>
+              <w:right w:type="dxa" w:w="100"/>
+            </w:tcMar>
+          </w:tcPr>
+          <w:p>
+            <w:r>
+              <w:rPr>
+                <w:b w:val="false"/>
+                <w:bCs w:val="false"/>
+                <w:sz w:val="18"/>
+                <w:szCs w:val="18"/>
+              </w:rPr>
+              <w:t xml:space="preserve">0,01</w:t>
+            </w:r>
+          </w:p>
+        </w:tc>
+      </w:tr>
+      <w:tr>
+        <w:tc>
+          <w:tcPr>
+            <w:tcW w:type="dxa" w:w="2900"/>
+            <w:tcBorders>
+              <w:top w:val="single" w:color="D0D5DD" w:sz="4"/>
+              <w:left w:val="single" w:color="D0D5DD" w:sz="4"/>
+              <w:bottom w:val="single" w:color="D0D5DD" w:sz="4"/>
+              <w:right w:val="single" w:color="D0D5DD" w:sz="4"/>
+            </w:tcBorders>
+            <w:tcMar>
+              <w:top w:type="dxa" w:w="60"/>
+              <w:left w:type="dxa" w:w="100"/>
+              <w:bottom w:type="dxa" w:w="60"/>
+              <w:right w:type="dxa" w:w="100"/>
+            </w:tcMar>
+          </w:tcPr>
+          <w:p>
+            <w:r>
+              <w:rPr>
+                <w:b w:val="false"/>
+                <w:bCs w:val="false"/>
+                <w:sz w:val="18"/>
+                <w:szCs w:val="18"/>
+              </w:rPr>
+              <w:t xml:space="preserve">mais de 300</w:t>
+            </w:r>
+          </w:p>
+        </w:tc>
+        <w:tc>
+          <w:tcPr>
+            <w:tcW w:type="dxa" w:w="2300"/>
+            <w:tcBorders>
+              <w:top w:val="single" w:color="D0D5DD" w:sz="4"/>
+              <w:left w:val="single" w:color="D0D5DD" w:sz="4"/>
+              <w:bottom w:val="single" w:color="D0D5DD" w:sz="4"/>
+              <w:right w:val="single" w:color="D0D5DD" w:sz="4"/>
+            </w:tcBorders>
+            <w:tcMar>
+              <w:top w:type="dxa" w:w="60"/>
+              <w:left w:type="dxa" w:w="100"/>
+              <w:bottom w:type="dxa" w:w="60"/>
+              <w:right w:type="dxa" w:w="100"/>
+            </w:tcMar>
+          </w:tcPr>
+          <w:p>
+            <w:r>
+              <w:rPr>
+                <w:b w:val="false"/>
+                <w:bCs w:val="false"/>
+                <w:sz w:val="18"/>
+                <w:szCs w:val="18"/>
+              </w:rPr>
+              <w:t xml:space="preserve">71.167</w:t>
+            </w:r>
+          </w:p>
+        </w:tc>
+        <w:tc>
+          <w:tcPr>
+            <w:tcW w:type="dxa" w:w="2200"/>
+            <w:tcBorders>
+              <w:top w:val="single" w:color="D0D5DD" w:sz="4"/>
+              <w:left w:val="single" w:color="D0D5DD" w:sz="4"/>
+              <w:bottom w:val="single" w:color="D0D5DD" w:sz="4"/>
+              <w:right w:val="single" w:color="D0D5DD" w:sz="4"/>
+            </w:tcBorders>
+            <w:tcMar>
+              <w:top w:type="dxa" w:w="60"/>
+              <w:left w:type="dxa" w:w="100"/>
+              <w:bottom w:type="dxa" w:w="60"/>
+              <w:right w:type="dxa" w:w="100"/>
+            </w:tcMar>
+          </w:tcPr>
+          <w:p>
+            <w:r>
+              <w:rPr>
+                <w:b w:val="false"/>
+                <w:bCs w:val="false"/>
+                <w:sz w:val="18"/>
+                <w:szCs w:val="18"/>
+              </w:rPr>
+              <w:t xml:space="preserve">4</w:t>
+            </w:r>
+          </w:p>
+        </w:tc>
+        <w:tc>
+          <w:tcPr>
+            <w:tcW w:type="dxa" w:w="2238"/>
+            <w:tcBorders>
+              <w:top w:val="single" w:color="D0D5DD" w:sz="4"/>
+              <w:left w:val="single" w:color="D0D5DD" w:sz="4"/>
+              <w:bottom w:val="single" w:color="D0D5DD" w:sz="4"/>
+              <w:right w:val="single" w:color="D0D5DD" w:sz="4"/>
+            </w:tcBorders>
+            <w:tcMar>
+              <w:top w:type="dxa" w:w="60"/>
+              <w:left w:type="dxa" w:w="100"/>
+              <w:bottom w:type="dxa" w:w="60"/>
+              <w:right w:type="dxa" w:w="100"/>
+            </w:tcMar>
+          </w:tcPr>
+          <w:p>
+            <w:r>
+              <w:rPr>
+                <w:b w:val="false"/>
+                <w:bCs w:val="false"/>
+                <w:sz w:val="18"/>
+                <w:szCs w:val="18"/>
+              </w:rPr>
+              <w:t xml:space="preserve">0,01</w:t>
+            </w:r>
+          </w:p>
+        </w:tc>
+      </w:tr>
+    </w:tbl>
+    <w:p>
+      <w:pPr>
+        <w:spacing w:after="220"/>
+      </w:pPr>
+      <w:r>
+        <w:rPr>
+          <w:i/>
+          <w:iCs/>
+          <w:color w:val="52514E"/>
+          <w:sz w:val="18"/>
+          <w:szCs w:val="18"/>
+        </w:rPr>
+        <w:t xml:space="preserve">Fonte: output/tables/v11_t2_anomalas_por_tamanho.csv. A lista completa das seções, com o desvio e os p-valores antes e depois da correção, está em output/tables/t2_secoes_anomalas.csv.</w:t>
       </w:r>
     </w:p>
     <w:tbl>
@@ -4541,12 +6061,936 @@
               <w:t xml:space="preserve">O tamanho importa. </w:t>
             </w:r>
             <w:r>
-              <w:t xml:space="preserve">As 461 seções somam 55.378 votos, ou 1,26% da diferença entre os candidatos (0,24% na versão ponderada). Mesmo que todos esses votos tivessem mudado de lado, o resultado não mudaria. O plano exige que achados assim sejam reportados como estatisticamente detectáveis, mas numericamente irrelevantes.</w:t>
+              <w:t xml:space="preserve">As 461 seções somam 55.378 votos. No pior caso imaginável, em que todos os votos de um candidato nelas fossem na verdade do outro, a margem nacional mudaria 2,5%, e 0,5% na versão ponderada. A margem oficial é de 4.430.191 votos; nenhum desses cenários chega perto de alterar o resultado. O plano exige que achados assim sejam reportados como estatisticamente detectáveis, mas numericamente irrelevantes.</w:t>
             </w:r>
           </w:p>
         </w:tc>
       </w:tr>
     </w:tbl>
+    <w:p>
+      <w:pPr>
+        <w:pStyle w:val="Heading2"/>
+        <w:spacing w:after="120" w:before="240"/>
+      </w:pPr>
+      <w:r>
+        <w:t xml:space="preserve">4.3 Outras formas de montar o modelo (revisão 1.1, exploratório)</w:t>
+      </w:r>
+    </w:p>
+    <w:p>
+      <w:pPr>
+        <w:spacing w:after="140" w:line="300"/>
+      </w:pPr>
+      <w:r>
+        <w:t xml:space="preserve">Para testar se a conclusão depende das escolhas do modelo, a análise das seções foi refeita de quatro outras maneiras, definidas e carimbadas antes de rodar:</w:t>
+      </w:r>
+    </w:p>
+    <w:tbl>
+      <w:tblPr>
+        <w:tblW w:type="dxa" w:w="9638"/>
+        <w:tblBorders>
+          <w:top w:val="single" w:color="auto" w:sz="4"/>
+          <w:left w:val="single" w:color="auto" w:sz="4"/>
+          <w:bottom w:val="single" w:color="auto" w:sz="4"/>
+          <w:right w:val="single" w:color="auto" w:sz="4"/>
+          <w:insideH w:val="single" w:color="auto" w:sz="4"/>
+          <w:insideV w:val="single" w:color="auto" w:sz="4"/>
+        </w:tblBorders>
+      </w:tblPr>
+      <w:tblGrid>
+        <w:gridCol w:w="2700"/>
+        <w:gridCol w:w="1300"/>
+        <w:gridCol w:w="1700"/>
+        <w:gridCol w:w="1200"/>
+        <w:gridCol w:w="1200"/>
+        <w:gridCol w:w="1538"/>
+      </w:tblGrid>
+      <w:tr>
+        <w:trPr>
+          <w:tblHeader/>
+        </w:trPr>
+        <w:tc>
+          <w:tcPr>
+            <w:tcW w:type="dxa" w:w="2700"/>
+            <w:tcBorders>
+              <w:top w:val="single" w:color="D0D5DD" w:sz="4"/>
+              <w:left w:val="single" w:color="D0D5DD" w:sz="4"/>
+              <w:bottom w:val="single" w:color="D0D5DD" w:sz="4"/>
+              <w:right w:val="single" w:color="D0D5DD" w:sz="4"/>
+            </w:tcBorders>
+            <w:shd w:fill="1F4E79" w:color="auto" w:val="clear"/>
+            <w:tcMar>
+              <w:top w:type="dxa" w:w="60"/>
+              <w:left w:type="dxa" w:w="100"/>
+              <w:bottom w:type="dxa" w:w="60"/>
+              <w:right w:type="dxa" w:w="100"/>
+            </w:tcMar>
+          </w:tcPr>
+          <w:p>
+            <w:r>
+              <w:rPr>
+                <w:b/>
+                <w:bCs/>
+                <w:color w:val="FFFFFF"/>
+                <w:sz w:val="18"/>
+                <w:szCs w:val="18"/>
+              </w:rPr>
+              <w:t xml:space="preserve">Especificação</w:t>
+            </w:r>
+          </w:p>
+        </w:tc>
+        <w:tc>
+          <w:tcPr>
+            <w:tcW w:type="dxa" w:w="1300"/>
+            <w:tcBorders>
+              <w:top w:val="single" w:color="D0D5DD" w:sz="4"/>
+              <w:left w:val="single" w:color="D0D5DD" w:sz="4"/>
+              <w:bottom w:val="single" w:color="D0D5DD" w:sz="4"/>
+              <w:right w:val="single" w:color="D0D5DD" w:sz="4"/>
+            </w:tcBorders>
+            <w:shd w:fill="1F4E79" w:color="auto" w:val="clear"/>
+            <w:tcMar>
+              <w:top w:type="dxa" w:w="60"/>
+              <w:left w:type="dxa" w:w="100"/>
+              <w:bottom w:type="dxa" w:w="60"/>
+              <w:right w:type="dxa" w:w="100"/>
+            </w:tcMar>
+          </w:tcPr>
+          <w:p>
+            <w:r>
+              <w:rPr>
+                <w:b/>
+                <w:bCs/>
+                <w:color w:val="FFFFFF"/>
+                <w:sz w:val="18"/>
+                <w:szCs w:val="18"/>
+              </w:rPr>
+              <w:t xml:space="preserve">Seções atípicas</w:t>
+            </w:r>
+          </w:p>
+        </w:tc>
+        <w:tc>
+          <w:tcPr>
+            <w:tcW w:type="dxa" w:w="1700"/>
+            <w:tcBorders>
+              <w:top w:val="single" w:color="D0D5DD" w:sz="4"/>
+              <w:left w:val="single" w:color="D0D5DD" w:sz="4"/>
+              <w:bottom w:val="single" w:color="D0D5DD" w:sz="4"/>
+              <w:right w:val="single" w:color="D0D5DD" w:sz="4"/>
+            </w:tcBorders>
+            <w:shd w:fill="1F4E79" w:color="auto" w:val="clear"/>
+            <w:tcMar>
+              <w:top w:type="dxa" w:w="60"/>
+              <w:left w:type="dxa" w:w="100"/>
+              <w:bottom w:type="dxa" w:w="60"/>
+              <w:right w:type="dxa" w:w="100"/>
+            </w:tcMar>
+          </w:tcPr>
+          <w:p>
+            <w:r>
+              <w:rPr>
+                <w:b/>
+                <w:bCs/>
+                <w:color w:val="FFFFFF"/>
+                <w:sz w:val="18"/>
+                <w:szCs w:val="18"/>
+              </w:rPr>
+              <w:t xml:space="preserve">Acima / abaixo do previsto para o 13</w:t>
+            </w:r>
+          </w:p>
+        </w:tc>
+        <w:tc>
+          <w:tcPr>
+            <w:tcW w:type="dxa" w:w="1200"/>
+            <w:tcBorders>
+              <w:top w:val="single" w:color="D0D5DD" w:sz="4"/>
+              <w:left w:val="single" w:color="D0D5DD" w:sz="4"/>
+              <w:bottom w:val="single" w:color="D0D5DD" w:sz="4"/>
+              <w:right w:val="single" w:color="D0D5DD" w:sz="4"/>
+            </w:tcBorders>
+            <w:shd w:fill="1F4E79" w:color="auto" w:val="clear"/>
+            <w:tcMar>
+              <w:top w:type="dxa" w:w="60"/>
+              <w:left w:type="dxa" w:w="100"/>
+              <w:bottom w:type="dxa" w:w="60"/>
+              <w:right w:type="dxa" w:w="100"/>
+            </w:tcMar>
+          </w:tcPr>
+          <w:p>
+            <w:r>
+              <w:rPr>
+                <w:b/>
+                <w:bCs/>
+                <w:color w:val="FFFFFF"/>
+                <w:sz w:val="18"/>
+                <w:szCs w:val="18"/>
+              </w:rPr>
+              <w:t xml:space="preserve">Agrupadas?</w:t>
+            </w:r>
+          </w:p>
+        </w:tc>
+        <w:tc>
+          <w:tcPr>
+            <w:tcW w:type="dxa" w:w="1200"/>
+            <w:tcBorders>
+              <w:top w:val="single" w:color="D0D5DD" w:sz="4"/>
+              <w:left w:val="single" w:color="D0D5DD" w:sz="4"/>
+              <w:bottom w:val="single" w:color="D0D5DD" w:sz="4"/>
+              <w:right w:val="single" w:color="D0D5DD" w:sz="4"/>
+            </w:tcBorders>
+            <w:shd w:fill="1F4E79" w:color="auto" w:val="clear"/>
+            <w:tcMar>
+              <w:top w:type="dxa" w:w="60"/>
+              <w:left w:type="dxa" w:w="100"/>
+              <w:bottom w:type="dxa" w:w="60"/>
+              <w:right w:type="dxa" w:w="100"/>
+            </w:tcMar>
+          </w:tcPr>
+          <w:p>
+            <w:r>
+              <w:rPr>
+                <w:b/>
+                <w:bCs/>
+                <w:color w:val="FFFFFF"/>
+                <w:sz w:val="18"/>
+                <w:szCs w:val="18"/>
+              </w:rPr>
+              <w:t xml:space="preserve">Direcionais?</w:t>
+            </w:r>
+          </w:p>
+        </w:tc>
+        <w:tc>
+          <w:tcPr>
+            <w:tcW w:type="dxa" w:w="1538"/>
+            <w:tcBorders>
+              <w:top w:val="single" w:color="D0D5DD" w:sz="4"/>
+              <w:left w:val="single" w:color="D0D5DD" w:sz="4"/>
+              <w:bottom w:val="single" w:color="D0D5DD" w:sz="4"/>
+              <w:right w:val="single" w:color="D0D5DD" w:sz="4"/>
+            </w:tcBorders>
+            <w:shd w:fill="1F4E79" w:color="auto" w:val="clear"/>
+            <w:tcMar>
+              <w:top w:type="dxa" w:w="60"/>
+              <w:left w:type="dxa" w:w="100"/>
+              <w:bottom w:type="dxa" w:w="60"/>
+              <w:right w:type="dxa" w:w="100"/>
+            </w:tcMar>
+          </w:tcPr>
+          <w:p>
+            <w:r>
+              <w:rPr>
+                <w:b/>
+                <w:bCs/>
+                <w:color w:val="FFFFFF"/>
+                <w:sz w:val="18"/>
+                <w:szCs w:val="18"/>
+              </w:rPr>
+              <w:t xml:space="preserve">Pior caso (% da margem)</w:t>
+            </w:r>
+          </w:p>
+        </w:tc>
+      </w:tr>
+      <w:tr>
+        <w:tc>
+          <w:tcPr>
+            <w:tcW w:type="dxa" w:w="2700"/>
+            <w:tcBorders>
+              <w:top w:val="single" w:color="D0D5DD" w:sz="4"/>
+              <w:left w:val="single" w:color="D0D5DD" w:sz="4"/>
+              <w:bottom w:val="single" w:color="D0D5DD" w:sz="4"/>
+              <w:right w:val="single" w:color="D0D5DD" w:sz="4"/>
+            </w:tcBorders>
+            <w:tcMar>
+              <w:top w:type="dxa" w:w="60"/>
+              <w:left w:type="dxa" w:w="100"/>
+              <w:bottom w:type="dxa" w:w="60"/>
+              <w:right w:type="dxa" w:w="100"/>
+            </w:tcMar>
+          </w:tcPr>
+          <w:p>
+            <w:r>
+              <w:rPr>
+                <w:b w:val="false"/>
+                <w:bCs w:val="false"/>
+                <w:sz w:val="18"/>
+                <w:szCs w:val="18"/>
+              </w:rPr>
+              <w:t xml:space="preserve">Sem perfil do eleitorado</w:t>
+            </w:r>
+          </w:p>
+        </w:tc>
+        <w:tc>
+          <w:tcPr>
+            <w:tcW w:type="dxa" w:w="1300"/>
+            <w:tcBorders>
+              <w:top w:val="single" w:color="D0D5DD" w:sz="4"/>
+              <w:left w:val="single" w:color="D0D5DD" w:sz="4"/>
+              <w:bottom w:val="single" w:color="D0D5DD" w:sz="4"/>
+              <w:right w:val="single" w:color="D0D5DD" w:sz="4"/>
+            </w:tcBorders>
+            <w:tcMar>
+              <w:top w:type="dxa" w:w="60"/>
+              <w:left w:type="dxa" w:w="100"/>
+              <w:bottom w:type="dxa" w:w="60"/>
+              <w:right w:type="dxa" w:w="100"/>
+            </w:tcMar>
+          </w:tcPr>
+          <w:p>
+            <w:r>
+              <w:rPr>
+                <w:b w:val="false"/>
+                <w:bCs w:val="false"/>
+                <w:sz w:val="18"/>
+                <w:szCs w:val="18"/>
+              </w:rPr>
+              <w:t xml:space="preserve">424</w:t>
+            </w:r>
+          </w:p>
+        </w:tc>
+        <w:tc>
+          <w:tcPr>
+            <w:tcW w:type="dxa" w:w="1700"/>
+            <w:tcBorders>
+              <w:top w:val="single" w:color="D0D5DD" w:sz="4"/>
+              <w:left w:val="single" w:color="D0D5DD" w:sz="4"/>
+              <w:bottom w:val="single" w:color="D0D5DD" w:sz="4"/>
+              <w:right w:val="single" w:color="D0D5DD" w:sz="4"/>
+            </w:tcBorders>
+            <w:tcMar>
+              <w:top w:type="dxa" w:w="60"/>
+              <w:left w:type="dxa" w:w="100"/>
+              <w:bottom w:type="dxa" w:w="60"/>
+              <w:right w:type="dxa" w:w="100"/>
+            </w:tcMar>
+          </w:tcPr>
+          <w:p>
+            <w:r>
+              <w:rPr>
+                <w:b w:val="false"/>
+                <w:bCs w:val="false"/>
+                <w:sz w:val="18"/>
+                <w:szCs w:val="18"/>
+              </w:rPr>
+              <w:t xml:space="preserve">259 / 165</w:t>
+            </w:r>
+          </w:p>
+        </w:tc>
+        <w:tc>
+          <w:tcPr>
+            <w:tcW w:type="dxa" w:w="1200"/>
+            <w:tcBorders>
+              <w:top w:val="single" w:color="D0D5DD" w:sz="4"/>
+              <w:left w:val="single" w:color="D0D5DD" w:sz="4"/>
+              <w:bottom w:val="single" w:color="D0D5DD" w:sz="4"/>
+              <w:right w:val="single" w:color="D0D5DD" w:sz="4"/>
+            </w:tcBorders>
+            <w:tcMar>
+              <w:top w:type="dxa" w:w="60"/>
+              <w:left w:type="dxa" w:w="100"/>
+              <w:bottom w:type="dxa" w:w="60"/>
+              <w:right w:type="dxa" w:w="100"/>
+            </w:tcMar>
+          </w:tcPr>
+          <w:p>
+            <w:r>
+              <w:rPr>
+                <w:b w:val="false"/>
+                <w:bCs w:val="false"/>
+                <w:sz w:val="18"/>
+                <w:szCs w:val="18"/>
+              </w:rPr>
+              <w:t xml:space="preserve">sim</w:t>
+            </w:r>
+          </w:p>
+        </w:tc>
+        <w:tc>
+          <w:tcPr>
+            <w:tcW w:type="dxa" w:w="1200"/>
+            <w:tcBorders>
+              <w:top w:val="single" w:color="D0D5DD" w:sz="4"/>
+              <w:left w:val="single" w:color="D0D5DD" w:sz="4"/>
+              <w:bottom w:val="single" w:color="D0D5DD" w:sz="4"/>
+              <w:right w:val="single" w:color="D0D5DD" w:sz="4"/>
+            </w:tcBorders>
+            <w:tcMar>
+              <w:top w:type="dxa" w:w="60"/>
+              <w:left w:type="dxa" w:w="100"/>
+              <w:bottom w:type="dxa" w:w="60"/>
+              <w:right w:type="dxa" w:w="100"/>
+            </w:tcMar>
+          </w:tcPr>
+          <w:p>
+            <w:r>
+              <w:rPr>
+                <w:b w:val="false"/>
+                <w:bCs w:val="false"/>
+                <w:sz w:val="18"/>
+                <w:szCs w:val="18"/>
+              </w:rPr>
+              <w:t xml:space="preserve">sim</w:t>
+            </w:r>
+          </w:p>
+        </w:tc>
+        <w:tc>
+          <w:tcPr>
+            <w:tcW w:type="dxa" w:w="1538"/>
+            <w:tcBorders>
+              <w:top w:val="single" w:color="D0D5DD" w:sz="4"/>
+              <w:left w:val="single" w:color="D0D5DD" w:sz="4"/>
+              <w:bottom w:val="single" w:color="D0D5DD" w:sz="4"/>
+              <w:right w:val="single" w:color="D0D5DD" w:sz="4"/>
+            </w:tcBorders>
+            <w:tcMar>
+              <w:top w:type="dxa" w:w="60"/>
+              <w:left w:type="dxa" w:w="100"/>
+              <w:bottom w:type="dxa" w:w="60"/>
+              <w:right w:type="dxa" w:w="100"/>
+            </w:tcMar>
+          </w:tcPr>
+          <w:p>
+            <w:r>
+              <w:rPr>
+                <w:b w:val="false"/>
+                <w:bCs w:val="false"/>
+                <w:sz w:val="18"/>
+                <w:szCs w:val="18"/>
+              </w:rPr>
+              <w:t xml:space="preserve">2,3</w:t>
+            </w:r>
+          </w:p>
+        </w:tc>
+      </w:tr>
+      <w:tr>
+        <w:tc>
+          <w:tcPr>
+            <w:tcW w:type="dxa" w:w="2700"/>
+            <w:tcBorders>
+              <w:top w:val="single" w:color="D0D5DD" w:sz="4"/>
+              <w:left w:val="single" w:color="D0D5DD" w:sz="4"/>
+              <w:bottom w:val="single" w:color="D0D5DD" w:sz="4"/>
+              <w:right w:val="single" w:color="D0D5DD" w:sz="4"/>
+            </w:tcBorders>
+            <w:tcMar>
+              <w:top w:type="dxa" w:w="60"/>
+              <w:left w:type="dxa" w:w="100"/>
+              <w:bottom w:type="dxa" w:w="60"/>
+              <w:right w:type="dxa" w:w="100"/>
+            </w:tcMar>
+          </w:tcPr>
+          <w:p>
+            <w:r>
+              <w:rPr>
+                <w:b w:val="false"/>
+                <w:bCs w:val="false"/>
+                <w:sz w:val="18"/>
+                <w:szCs w:val="18"/>
+              </w:rPr>
+              <w:t xml:space="preserve">Logit, peso = votos (como planejado)</w:t>
+            </w:r>
+          </w:p>
+        </w:tc>
+        <w:tc>
+          <w:tcPr>
+            <w:tcW w:type="dxa" w:w="1300"/>
+            <w:tcBorders>
+              <w:top w:val="single" w:color="D0D5DD" w:sz="4"/>
+              <w:left w:val="single" w:color="D0D5DD" w:sz="4"/>
+              <w:bottom w:val="single" w:color="D0D5DD" w:sz="4"/>
+              <w:right w:val="single" w:color="D0D5DD" w:sz="4"/>
+            </w:tcBorders>
+            <w:tcMar>
+              <w:top w:type="dxa" w:w="60"/>
+              <w:left w:type="dxa" w:w="100"/>
+              <w:bottom w:type="dxa" w:w="60"/>
+              <w:right w:type="dxa" w:w="100"/>
+            </w:tcMar>
+          </w:tcPr>
+          <w:p>
+            <w:r>
+              <w:rPr>
+                <w:b w:val="false"/>
+                <w:bCs w:val="false"/>
+                <w:sz w:val="18"/>
+                <w:szCs w:val="18"/>
+              </w:rPr>
+              <w:t xml:space="preserve">3.091</w:t>
+            </w:r>
+          </w:p>
+        </w:tc>
+        <w:tc>
+          <w:tcPr>
+            <w:tcW w:type="dxa" w:w="1700"/>
+            <w:tcBorders>
+              <w:top w:val="single" w:color="D0D5DD" w:sz="4"/>
+              <w:left w:val="single" w:color="D0D5DD" w:sz="4"/>
+              <w:bottom w:val="single" w:color="D0D5DD" w:sz="4"/>
+              <w:right w:val="single" w:color="D0D5DD" w:sz="4"/>
+            </w:tcBorders>
+            <w:tcMar>
+              <w:top w:type="dxa" w:w="60"/>
+              <w:left w:type="dxa" w:w="100"/>
+              <w:bottom w:type="dxa" w:w="60"/>
+              <w:right w:type="dxa" w:w="100"/>
+            </w:tcMar>
+          </w:tcPr>
+          <w:p>
+            <w:r>
+              <w:rPr>
+                <w:b w:val="false"/>
+                <w:bCs w:val="false"/>
+                <w:sz w:val="18"/>
+                <w:szCs w:val="18"/>
+              </w:rPr>
+              <w:t xml:space="preserve">2.456 / 635</w:t>
+            </w:r>
+          </w:p>
+        </w:tc>
+        <w:tc>
+          <w:tcPr>
+            <w:tcW w:type="dxa" w:w="1200"/>
+            <w:tcBorders>
+              <w:top w:val="single" w:color="D0D5DD" w:sz="4"/>
+              <w:left w:val="single" w:color="D0D5DD" w:sz="4"/>
+              <w:bottom w:val="single" w:color="D0D5DD" w:sz="4"/>
+              <w:right w:val="single" w:color="D0D5DD" w:sz="4"/>
+            </w:tcBorders>
+            <w:tcMar>
+              <w:top w:type="dxa" w:w="60"/>
+              <w:left w:type="dxa" w:w="100"/>
+              <w:bottom w:type="dxa" w:w="60"/>
+              <w:right w:type="dxa" w:w="100"/>
+            </w:tcMar>
+          </w:tcPr>
+          <w:p>
+            <w:r>
+              <w:rPr>
+                <w:b w:val="false"/>
+                <w:bCs w:val="false"/>
+                <w:sz w:val="18"/>
+                <w:szCs w:val="18"/>
+              </w:rPr>
+              <w:t xml:space="preserve">sim</w:t>
+            </w:r>
+          </w:p>
+        </w:tc>
+        <w:tc>
+          <w:tcPr>
+            <w:tcW w:type="dxa" w:w="1200"/>
+            <w:tcBorders>
+              <w:top w:val="single" w:color="D0D5DD" w:sz="4"/>
+              <w:left w:val="single" w:color="D0D5DD" w:sz="4"/>
+              <w:bottom w:val="single" w:color="D0D5DD" w:sz="4"/>
+              <w:right w:val="single" w:color="D0D5DD" w:sz="4"/>
+            </w:tcBorders>
+            <w:tcMar>
+              <w:top w:type="dxa" w:w="60"/>
+              <w:left w:type="dxa" w:w="100"/>
+              <w:bottom w:type="dxa" w:w="60"/>
+              <w:right w:type="dxa" w:w="100"/>
+            </w:tcMar>
+          </w:tcPr>
+          <w:p>
+            <w:r>
+              <w:rPr>
+                <w:b w:val="false"/>
+                <w:bCs w:val="false"/>
+                <w:sz w:val="18"/>
+                <w:szCs w:val="18"/>
+              </w:rPr>
+              <w:t xml:space="preserve">sim</w:t>
+            </w:r>
+          </w:p>
+        </w:tc>
+        <w:tc>
+          <w:tcPr>
+            <w:tcW w:type="dxa" w:w="1538"/>
+            <w:tcBorders>
+              <w:top w:val="single" w:color="D0D5DD" w:sz="4"/>
+              <w:left w:val="single" w:color="D0D5DD" w:sz="4"/>
+              <w:bottom w:val="single" w:color="D0D5DD" w:sz="4"/>
+              <w:right w:val="single" w:color="D0D5DD" w:sz="4"/>
+            </w:tcBorders>
+            <w:tcMar>
+              <w:top w:type="dxa" w:w="60"/>
+              <w:left w:type="dxa" w:w="100"/>
+              <w:bottom w:type="dxa" w:w="60"/>
+              <w:right w:type="dxa" w:w="100"/>
+            </w:tcMar>
+          </w:tcPr>
+          <w:p>
+            <w:r>
+              <w:rPr>
+                <w:b w:val="false"/>
+                <w:bCs w:val="false"/>
+                <w:sz w:val="18"/>
+                <w:szCs w:val="18"/>
+              </w:rPr>
+              <w:t xml:space="preserve">29,3</w:t>
+            </w:r>
+          </w:p>
+        </w:tc>
+      </w:tr>
+      <w:tr>
+        <w:tc>
+          <w:tcPr>
+            <w:tcW w:type="dxa" w:w="2700"/>
+            <w:tcBorders>
+              <w:top w:val="single" w:color="D0D5DD" w:sz="4"/>
+              <w:left w:val="single" w:color="D0D5DD" w:sz="4"/>
+              <w:bottom w:val="single" w:color="D0D5DD" w:sz="4"/>
+              <w:right w:val="single" w:color="D0D5DD" w:sz="4"/>
+            </w:tcBorders>
+            <w:tcMar>
+              <w:top w:type="dxa" w:w="60"/>
+              <w:left w:type="dxa" w:w="100"/>
+              <w:bottom w:type="dxa" w:w="60"/>
+              <w:right w:type="dxa" w:w="100"/>
+            </w:tcMar>
+          </w:tcPr>
+          <w:p>
+            <w:r>
+              <w:rPr>
+                <w:b w:val="false"/>
+                <w:bCs w:val="false"/>
+                <w:sz w:val="18"/>
+                <w:szCs w:val="18"/>
+              </w:rPr>
+              <w:t xml:space="preserve">Logit, peso de variância correto (adendo)</w:t>
+            </w:r>
+          </w:p>
+        </w:tc>
+        <w:tc>
+          <w:tcPr>
+            <w:tcW w:type="dxa" w:w="1300"/>
+            <w:tcBorders>
+              <w:top w:val="single" w:color="D0D5DD" w:sz="4"/>
+              <w:left w:val="single" w:color="D0D5DD" w:sz="4"/>
+              <w:bottom w:val="single" w:color="D0D5DD" w:sz="4"/>
+              <w:right w:val="single" w:color="D0D5DD" w:sz="4"/>
+            </w:tcBorders>
+            <w:tcMar>
+              <w:top w:type="dxa" w:w="60"/>
+              <w:left w:type="dxa" w:w="100"/>
+              <w:bottom w:type="dxa" w:w="60"/>
+              <w:right w:type="dxa" w:w="100"/>
+            </w:tcMar>
+          </w:tcPr>
+          <w:p>
+            <w:r>
+              <w:rPr>
+                <w:b w:val="false"/>
+                <w:bCs w:val="false"/>
+                <w:sz w:val="18"/>
+                <w:szCs w:val="18"/>
+              </w:rPr>
+              <w:t xml:space="preserve">1.276</w:t>
+            </w:r>
+          </w:p>
+        </w:tc>
+        <w:tc>
+          <w:tcPr>
+            <w:tcW w:type="dxa" w:w="1700"/>
+            <w:tcBorders>
+              <w:top w:val="single" w:color="D0D5DD" w:sz="4"/>
+              <w:left w:val="single" w:color="D0D5DD" w:sz="4"/>
+              <w:bottom w:val="single" w:color="D0D5DD" w:sz="4"/>
+              <w:right w:val="single" w:color="D0D5DD" w:sz="4"/>
+            </w:tcBorders>
+            <w:tcMar>
+              <w:top w:type="dxa" w:w="60"/>
+              <w:left w:type="dxa" w:w="100"/>
+              <w:bottom w:type="dxa" w:w="60"/>
+              <w:right w:type="dxa" w:w="100"/>
+            </w:tcMar>
+          </w:tcPr>
+          <w:p>
+            <w:r>
+              <w:rPr>
+                <w:b w:val="false"/>
+                <w:bCs w:val="false"/>
+                <w:sz w:val="18"/>
+                <w:szCs w:val="18"/>
+              </w:rPr>
+              <w:t xml:space="preserve">1.106 / 170</w:t>
+            </w:r>
+          </w:p>
+        </w:tc>
+        <w:tc>
+          <w:tcPr>
+            <w:tcW w:type="dxa" w:w="1200"/>
+            <w:tcBorders>
+              <w:top w:val="single" w:color="D0D5DD" w:sz="4"/>
+              <w:left w:val="single" w:color="D0D5DD" w:sz="4"/>
+              <w:bottom w:val="single" w:color="D0D5DD" w:sz="4"/>
+              <w:right w:val="single" w:color="D0D5DD" w:sz="4"/>
+            </w:tcBorders>
+            <w:tcMar>
+              <w:top w:type="dxa" w:w="60"/>
+              <w:left w:type="dxa" w:w="100"/>
+              <w:bottom w:type="dxa" w:w="60"/>
+              <w:right w:type="dxa" w:w="100"/>
+            </w:tcMar>
+          </w:tcPr>
+          <w:p>
+            <w:r>
+              <w:rPr>
+                <w:b w:val="false"/>
+                <w:bCs w:val="false"/>
+                <w:sz w:val="18"/>
+                <w:szCs w:val="18"/>
+              </w:rPr>
+              <w:t xml:space="preserve">sim</w:t>
+            </w:r>
+          </w:p>
+        </w:tc>
+        <w:tc>
+          <w:tcPr>
+            <w:tcW w:type="dxa" w:w="1200"/>
+            <w:tcBorders>
+              <w:top w:val="single" w:color="D0D5DD" w:sz="4"/>
+              <w:left w:val="single" w:color="D0D5DD" w:sz="4"/>
+              <w:bottom w:val="single" w:color="D0D5DD" w:sz="4"/>
+              <w:right w:val="single" w:color="D0D5DD" w:sz="4"/>
+            </w:tcBorders>
+            <w:tcMar>
+              <w:top w:type="dxa" w:w="60"/>
+              <w:left w:type="dxa" w:w="100"/>
+              <w:bottom w:type="dxa" w:w="60"/>
+              <w:right w:type="dxa" w:w="100"/>
+            </w:tcMar>
+          </w:tcPr>
+          <w:p>
+            <w:r>
+              <w:rPr>
+                <w:b w:val="false"/>
+                <w:bCs w:val="false"/>
+                <w:sz w:val="18"/>
+                <w:szCs w:val="18"/>
+              </w:rPr>
+              <w:t xml:space="preserve">sim</w:t>
+            </w:r>
+          </w:p>
+        </w:tc>
+        <w:tc>
+          <w:tcPr>
+            <w:tcW w:type="dxa" w:w="1538"/>
+            <w:tcBorders>
+              <w:top w:val="single" w:color="D0D5DD" w:sz="4"/>
+              <w:left w:val="single" w:color="D0D5DD" w:sz="4"/>
+              <w:bottom w:val="single" w:color="D0D5DD" w:sz="4"/>
+              <w:right w:val="single" w:color="D0D5DD" w:sz="4"/>
+            </w:tcBorders>
+            <w:tcMar>
+              <w:top w:type="dxa" w:w="60"/>
+              <w:left w:type="dxa" w:w="100"/>
+              <w:bottom w:type="dxa" w:w="60"/>
+              <w:right w:type="dxa" w:w="100"/>
+            </w:tcMar>
+          </w:tcPr>
+          <w:p>
+            <w:r>
+              <w:rPr>
+                <w:b w:val="false"/>
+                <w:bCs w:val="false"/>
+                <w:sz w:val="18"/>
+                <w:szCs w:val="18"/>
+              </w:rPr>
+              <w:t xml:space="preserve">13,3</w:t>
+            </w:r>
+          </w:p>
+        </w:tc>
+      </w:tr>
+      <w:tr>
+        <w:tc>
+          <w:tcPr>
+            <w:tcW w:type="dxa" w:w="2700"/>
+            <w:tcBorders>
+              <w:top w:val="single" w:color="D0D5DD" w:sz="4"/>
+              <w:left w:val="single" w:color="D0D5DD" w:sz="4"/>
+              <w:bottom w:val="single" w:color="D0D5DD" w:sz="4"/>
+              <w:right w:val="single" w:color="D0D5DD" w:sz="4"/>
+            </w:tcBorders>
+            <w:tcMar>
+              <w:top w:type="dxa" w:w="60"/>
+              <w:left w:type="dxa" w:w="100"/>
+              <w:bottom w:type="dxa" w:w="60"/>
+              <w:right w:type="dxa" w:w="100"/>
+            </w:tcMar>
+          </w:tcPr>
+          <w:p>
+            <w:r>
+              <w:rPr>
+                <w:b w:val="false"/>
+                <w:bCs w:val="false"/>
+                <w:sz w:val="18"/>
+                <w:szCs w:val="18"/>
+              </w:rPr>
+              <w:t xml:space="preserve">Ponderado, sem locais indígenas</w:t>
+            </w:r>
+          </w:p>
+        </w:tc>
+        <w:tc>
+          <w:tcPr>
+            <w:tcW w:type="dxa" w:w="1300"/>
+            <w:tcBorders>
+              <w:top w:val="single" w:color="D0D5DD" w:sz="4"/>
+              <w:left w:val="single" w:color="D0D5DD" w:sz="4"/>
+              <w:bottom w:val="single" w:color="D0D5DD" w:sz="4"/>
+              <w:right w:val="single" w:color="D0D5DD" w:sz="4"/>
+            </w:tcBorders>
+            <w:tcMar>
+              <w:top w:type="dxa" w:w="60"/>
+              <w:left w:type="dxa" w:w="100"/>
+              <w:bottom w:type="dxa" w:w="60"/>
+              <w:right w:type="dxa" w:w="100"/>
+            </w:tcMar>
+          </w:tcPr>
+          <w:p>
+            <w:r>
+              <w:rPr>
+                <w:b w:val="false"/>
+                <w:bCs w:val="false"/>
+                <w:sz w:val="18"/>
+                <w:szCs w:val="18"/>
+              </w:rPr>
+              <w:t xml:space="preserve">38</w:t>
+            </w:r>
+          </w:p>
+        </w:tc>
+        <w:tc>
+          <w:tcPr>
+            <w:tcW w:type="dxa" w:w="1700"/>
+            <w:tcBorders>
+              <w:top w:val="single" w:color="D0D5DD" w:sz="4"/>
+              <w:left w:val="single" w:color="D0D5DD" w:sz="4"/>
+              <w:bottom w:val="single" w:color="D0D5DD" w:sz="4"/>
+              <w:right w:val="single" w:color="D0D5DD" w:sz="4"/>
+            </w:tcBorders>
+            <w:tcMar>
+              <w:top w:type="dxa" w:w="60"/>
+              <w:left w:type="dxa" w:w="100"/>
+              <w:bottom w:type="dxa" w:w="60"/>
+              <w:right w:type="dxa" w:w="100"/>
+            </w:tcMar>
+          </w:tcPr>
+          <w:p>
+            <w:r>
+              <w:rPr>
+                <w:b w:val="false"/>
+                <w:bCs w:val="false"/>
+                <w:sz w:val="18"/>
+                <w:szCs w:val="18"/>
+              </w:rPr>
+              <w:t xml:space="preserve">22 / 16</w:t>
+            </w:r>
+          </w:p>
+        </w:tc>
+        <w:tc>
+          <w:tcPr>
+            <w:tcW w:type="dxa" w:w="1200"/>
+            <w:tcBorders>
+              <w:top w:val="single" w:color="D0D5DD" w:sz="4"/>
+              <w:left w:val="single" w:color="D0D5DD" w:sz="4"/>
+              <w:bottom w:val="single" w:color="D0D5DD" w:sz="4"/>
+              <w:right w:val="single" w:color="D0D5DD" w:sz="4"/>
+            </w:tcBorders>
+            <w:tcMar>
+              <w:top w:type="dxa" w:w="60"/>
+              <w:left w:type="dxa" w:w="100"/>
+              <w:bottom w:type="dxa" w:w="60"/>
+              <w:right w:type="dxa" w:w="100"/>
+            </w:tcMar>
+          </w:tcPr>
+          <w:p>
+            <w:r>
+              <w:rPr>
+                <w:b w:val="false"/>
+                <w:bCs w:val="false"/>
+                <w:sz w:val="18"/>
+                <w:szCs w:val="18"/>
+              </w:rPr>
+              <w:t xml:space="preserve">sim</w:t>
+            </w:r>
+          </w:p>
+        </w:tc>
+        <w:tc>
+          <w:tcPr>
+            <w:tcW w:type="dxa" w:w="1200"/>
+            <w:tcBorders>
+              <w:top w:val="single" w:color="D0D5DD" w:sz="4"/>
+              <w:left w:val="single" w:color="D0D5DD" w:sz="4"/>
+              <w:bottom w:val="single" w:color="D0D5DD" w:sz="4"/>
+              <w:right w:val="single" w:color="D0D5DD" w:sz="4"/>
+            </w:tcBorders>
+            <w:tcMar>
+              <w:top w:type="dxa" w:w="60"/>
+              <w:left w:type="dxa" w:w="100"/>
+              <w:bottom w:type="dxa" w:w="60"/>
+              <w:right w:type="dxa" w:w="100"/>
+            </w:tcMar>
+          </w:tcPr>
+          <w:p>
+            <w:r>
+              <w:rPr>
+                <w:b w:val="false"/>
+                <w:bCs w:val="false"/>
+                <w:sz w:val="18"/>
+                <w:szCs w:val="18"/>
+              </w:rPr>
+              <w:t xml:space="preserve">não</w:t>
+            </w:r>
+          </w:p>
+        </w:tc>
+        <w:tc>
+          <w:tcPr>
+            <w:tcW w:type="dxa" w:w="1538"/>
+            <w:tcBorders>
+              <w:top w:val="single" w:color="D0D5DD" w:sz="4"/>
+              <w:left w:val="single" w:color="D0D5DD" w:sz="4"/>
+              <w:bottom w:val="single" w:color="D0D5DD" w:sz="4"/>
+              <w:right w:val="single" w:color="D0D5DD" w:sz="4"/>
+            </w:tcBorders>
+            <w:tcMar>
+              <w:top w:type="dxa" w:w="60"/>
+              <w:left w:type="dxa" w:w="100"/>
+              <w:bottom w:type="dxa" w:w="60"/>
+              <w:right w:type="dxa" w:w="100"/>
+            </w:tcMar>
+          </w:tcPr>
+          <w:p>
+            <w:r>
+              <w:rPr>
+                <w:b w:val="false"/>
+                <w:bCs w:val="false"/>
+                <w:sz w:val="18"/>
+                <w:szCs w:val="18"/>
+              </w:rPr>
+              <w:t xml:space="preserve">0,4</w:t>
+            </w:r>
+          </w:p>
+        </w:tc>
+      </w:tr>
+    </w:tbl>
+    <w:p>
+      <w:pPr>
+        <w:spacing w:after="120"/>
+      </w:pPr>
+    </w:p>
+    <w:p>
+      <w:pPr>
+        <w:spacing w:after="140" w:line="300"/>
+      </w:pPr>
+      <w:r>
+        <w:t xml:space="preserve">Sem o perfil do eleitorado, o quadro é parecido com o principal. Excluindo os locais indígenas, sobram poucas seções, e elas deixam de apontar numa direção predominante, o que apoia a explicação das aldeias. As duas versões em escala logit, porém, apontam muito mais seções. A versão planejada tinha um erro de especificação reconhecido, e foi corrigida por um adendo carimbado antes da nova rodada. Mesmo corrigida, ela indica 1.276 seções, 83% delas em redutos onde o 13 teve mais de 90% dos votos (faixa que reúne só 1,4% das seções do país).</w:t>
+      </w:r>
+    </w:p>
+    <w:p>
+      <w:pPr>
+        <w:spacing w:after="140" w:line="300"/>
+      </w:pPr>
+      <w:r>
+        <w:t xml:space="preserve">O que se sabe dessas seções: o 13 já tinha, na mediana, 94% dos votos nelas no 1º turno e passou a 96% no 2º; ficam sobretudo em MA, AM, BA, PA; 20% estão em locais indígenas. O ganho entre turnos nelas (+2,0 pontos na mediana) é o mesmo observado no conjunto das 6.802 seções em que o 13 passou de 90% (+2,7). Isso é compatível com um efeito da escala logit, que amplia diferenças perto de 100%. A hipótese, porém, não foi testada formalmente, e o resultado fica registrado como não explicado. Mesmo no pior caso (13,3% da margem), ele não alcança a diferença entre os candidatos.</w:t>
+      </w:r>
+    </w:p>
     <w:p>
       <w:pPr>
         <w:pStyle w:val="Heading1"/>
@@ -4702,7 +7146,7 @@
         <w:spacing w:after="140" w:line="300"/>
       </w:pPr>
       <w:r>
-        <w:t xml:space="preserve">Em resumo, as pesquisas erraram mais do que costumam errar, e na mesma direção. Esse é um problema de medição das pesquisas. Não diz nada, por si só, sobre a apuração dos votos.</w:t>
+        <w:t xml:space="preserve">Em resumo, as pesquisas erraram mais do que costumam errar, e na mesma direção. Dezenove pesquisas, porém, não são dezenove observações independentes: institutos compartilham métodos, cadastros, formas de ponderação e dificuldades de amostragem. Entender o mecanismo (não resposta, ponderação, decisão tardia, diferença entre comparecimento projetado e real) exigiria os microdados dos institutos, que não são públicos, e fica como estudo à parte. Esse é um problema de medição das pesquisas e não diz nada, por si só, sobre a apuração dos votos.</w:t>
       </w:r>
     </w:p>
     <w:p>
@@ -4805,7 +7249,7 @@
         <w:spacing w:after="140" w:line="300"/>
       </w:pPr>
       <w:r>
-        <w:t xml:space="preserve">Na base, houve 12 viradas em 42 casos, concentradas nas vantagens pequenas. Um modelo estatístico estima que, com vantagem de 1,9 ponto, a chance de virada é de cerca de 49% (intervalo de 95%: 27 a 71%). Entre os dez casos de vantagem mais parecida, houve 5 viradas. A virada de 2026, portanto, é compatível com a experiência histórica para uma disputa tão apertada.</w:t>
+        <w:t xml:space="preserve">Na base, houve 12 viradas em 42 casos, concentradas nas vantagens pequenas. Um modelo estatístico estima que, com vantagem de 1,9 ponto, a chance de virada é da ordem de metade (estimativa central de 49%), mas com grande incerteza: o intervalo de 95% vai de 27 a 71%. Entre os dez casos de vantagem mais parecida, houve 5 viradas. Duas ressalvas: eleições de países diferentes não são observações equivalentes (sistemas partidários, regras e eleitorados diferem), e 42 casos são uma base pequena. O número não deve ser lido como probabilidade precisa; o que ele indica é que viradas com vantagens desse tamanho não são raras.</w:t>
       </w:r>
     </w:p>
     <w:p>
@@ -5241,7 +7685,7 @@
                 <w:sz w:val="18"/>
                 <w:szCs w:val="18"/>
               </w:rPr>
-              <w:t xml:space="preserve">Atendido</w:t>
+              <w:t xml:space="preserve">Atendido pelos critérios fixados (ver ressalva abaixo)</w:t>
             </w:r>
           </w:p>
         </w:tc>
@@ -5327,7 +7771,7 @@
                 <w:sz w:val="18"/>
                 <w:szCs w:val="18"/>
               </w:rPr>
-              <w:t xml:space="preserve">Não atendido: o único achado formal envolve 1,26% da margem</w:t>
+              <w:t xml:space="preserve">Não atendido: no pior caso, o achado principal mexeria em 2,5% da margem (13,3% na especificação alternativa mais desfavorável)</w:t>
             </w:r>
           </w:p>
         </w:tc>
@@ -5343,9 +7787,60 @@
         <w:spacing w:after="140" w:line="300"/>
       </w:pPr>
       <w:r>
-        <w:t xml:space="preserve">Desfecho B. O plano também determina que nenhum desfecho autoriza conclusão nacional baseada só em raciocínio agregado: qualquer alegação formal precisaria apontar urnas específicas, e nenhuma urna com divergência de contagem foi encontrada.</w:t>
-      </w:r>
-    </w:p>
+        <w:t xml:space="preserve">Desfecho B, com uma ressalva de leitura: o nome do desfecho, "anomalia com causa mundana", vem do plano, mas não deve ser lido como se todas as anomalias tivessem explicação causal definitiva. Os achados são localizados, numericamente irrelevantes para o resultado e compatíveis com limitações do modelo; parte deles (a especificação logit da seção 4.3) segue sem explicação demonstrada. O plano também determina que nenhum desfecho autoriza conclusão nacional baseada só em raciocínio agregado: uma alegação formal precisaria apontar urnas específicas, e nenhuma urna com divergência de contagem foi encontrada.</w:t>
+      </w:r>
+    </w:p>
+    <w:tbl>
+      <w:tblPr>
+        <w:tblW w:type="dxa" w:w="9638"/>
+        <w:tblBorders>
+          <w:top w:val="single" w:color="auto" w:sz="4"/>
+          <w:left w:val="single" w:color="auto" w:sz="4"/>
+          <w:bottom w:val="single" w:color="auto" w:sz="4"/>
+          <w:right w:val="single" w:color="auto" w:sz="4"/>
+          <w:insideH w:val="single" w:color="auto" w:sz="4"/>
+          <w:insideV w:val="single" w:color="auto" w:sz="4"/>
+        </w:tblBorders>
+      </w:tblPr>
+      <w:tblGrid>
+        <w:gridCol w:w="9638"/>
+      </w:tblGrid>
+      <w:tr>
+        <w:tc>
+          <w:tcPr>
+            <w:tcW w:type="dxa" w:w="9638"/>
+            <w:tcBorders>
+              <w:top w:val="single" w:color="1F4E79" w:sz="18"/>
+              <w:left w:val="single" w:color="D0D5DD" w:sz="4"/>
+              <w:bottom w:val="single" w:color="D0D5DD" w:sz="4"/>
+              <w:right w:val="single" w:color="D0D5DD" w:sz="4"/>
+            </w:tcBorders>
+            <w:shd w:fill="F2F4F7" w:color="auto" w:val="clear"/>
+            <w:tcMar>
+              <w:top w:type="dxa" w:w="140"/>
+              <w:left w:type="dxa" w:w="200"/>
+              <w:bottom w:type="dxa" w:w="140"/>
+              <w:right w:type="dxa" w:w="200"/>
+            </w:tcMar>
+          </w:tcPr>
+          <w:p>
+            <w:pPr>
+              <w:spacing w:after="0"/>
+            </w:pPr>
+            <w:r>
+              <w:rPr>
+                <w:b/>
+                <w:bCs/>
+              </w:rPr>
+              <w:t xml:space="preserve">O alcance das conclusões. </w:t>
+            </w:r>
+            <w:r>
+              <w:t xml:space="preserve">Há três afirmações diferentes. (1) Não houve divergência de contagem na amostra: demonstrado. (2) Os padrões estatísticos de 2026 são compatíveis com os de eleições anteriores: sustentado, com as ressalvas acima. (3) Não houve fraude: este trabalho não tem capacidade para demonstrar isso, e não afirma.</w:t>
+            </w:r>
+          </w:p>
+        </w:tc>
+      </w:tr>
+    </w:tbl>
     <w:p>
       <w:pPr>
         <w:pStyle w:val="Heading1"/>
@@ -5365,7 +7860,7 @@
         <w:spacing w:after="90" w:line="290"/>
       </w:pPr>
       <w:r>
-        <w:t xml:space="preserve">A conferência de boletins é amostral (5.692 urnas). Ela limita a proporção possível de urnas com problema, mas não examina cada urna do país.</w:t>
+        <w:t xml:space="preserve">Não há prova externa de que o pré-registro original antecede a coleta (seção 2.1). Desde a revisão 1.1, os planos novos são carimbados externamente antes de executados.</w:t>
       </w:r>
     </w:p>
     <w:p>
@@ -5378,7 +7873,7 @@
         <w:spacing w:after="90" w:line="290"/>
       </w:pPr>
       <w:r>
-        <w:t xml:space="preserve">Os percentuais das pesquisas e os resultados de outros países vêm de compilações da Wikipedia, com versões fixadas e cruzadas com o registro do TSE quando possível. Valores extremos devem ser conferidos nas fontes primárias.</w:t>
+        <w:t xml:space="preserve">A conferência de boletins é amostral (5.692 urnas). Ela limita a proporção possível de urnas com problema, mas não examina cada urna do país; os votos das 205 seções agregadas sorteadas não foram verificados; e ela não cobre a correspondência entre a intenção do eleitor e o registro na urna.</w:t>
       </w:r>
     </w:p>
     <w:p>
@@ -5391,7 +7886,7 @@
         <w:spacing w:after="90" w:line="290"/>
       </w:pPr>
       <w:r>
-        <w:t xml:space="preserve">O modelo espacial foi aplicado por município, e não por seção como previa o plano, porque não há dados por seção para os anos de comparação. A mudança está registrada.</w:t>
+        <w:t xml:space="preserve">Uma especificação alternativa do modelo de seções (seção 4.3) aponta 1.276 seções em redutos do 13 que seguem sem explicação demonstrada.</w:t>
       </w:r>
     </w:p>
     <w:p>
@@ -5404,7 +7899,7 @@
         <w:spacing w:after="90" w:line="290"/>
       </w:pPr>
       <w:r>
-        <w:t xml:space="preserve">Relatos de coação de eleitores (por exemplo, idosos acompanhados na cabine) não entram como métrica. Vídeos compartilhados não formam amostra; cada caso deve ser denunciado individualmente ao Ministério Público Eleitoral.</w:t>
+        <w:t xml:space="preserve">Os percentuais das pesquisas e os resultados de outros países vêm de compilações da Wikipedia, com versões fixadas e cruzadas com o registro do TSE quando possível. Valores extremos devem ser conferidos nas fontes primárias.</w:t>
       </w:r>
     </w:p>
     <w:p>
@@ -5417,7 +7912,7 @@
         <w:spacing w:after="90" w:line="290"/>
       </w:pPr>
       <w:r>
-        <w:t xml:space="preserve">Dados agregados não revelam o voto de ninguém. Os fluxos entre turnos descritos aqui são compatíveis com os totais, não comprovam transferência individual de votos.</w:t>
+        <w:t xml:space="preserve">O modelo espacial foi aplicado por município, e não por seção como previa o plano, porque não há dados por seção para os anos de comparação. A mudança está registrada.</w:t>
       </w:r>
     </w:p>
     <w:p>
@@ -5430,24 +7925,7 @@
         <w:spacing w:after="90" w:line="290"/>
       </w:pPr>
       <w:r>
-        <w:t xml:space="preserve">Esta é uma versão preliminar. A revisão adversarial, por alguém que não compartilhe a expectativa do autor, está em aberto, e eventuais correções serão registradas publicamente.</w:t>
-      </w:r>
-    </w:p>
-    <w:p>
-      <w:pPr>
-        <w:pStyle w:val="Heading1"/>
-        <w:spacing w:after="160" w:before="360"/>
-      </w:pPr>
-      <w:r>
-        <w:t xml:space="preserve">10. Verifique você mesmo</w:t>
-      </w:r>
-    </w:p>
-    <w:p>
-      <w:pPr>
-        <w:spacing w:after="140" w:line="300"/>
-      </w:pPr>
-      <w:r>
-        <w:t xml:space="preserve">Tudo está disponível para conferência e reprodução:</w:t>
+        <w:t xml:space="preserve">Relatos de coação de eleitores (por exemplo, idosos acompanhados na cabine) não entram como métrica. Vídeos compartilhados não formam amostra; cada caso deve ser denunciado individualmente ao Ministério Público Eleitoral.</w:t>
       </w:r>
     </w:p>
     <w:p>
@@ -5460,9 +7938,52 @@
         <w:spacing w:after="90" w:line="290"/>
       </w:pPr>
       <w:r>
+        <w:t xml:space="preserve">Dados agregados não revelam o voto de ninguém. Os fluxos entre turnos descritos aqui são compatíveis com os totais, não comprovam transferência individual de votos.</w:t>
+      </w:r>
+    </w:p>
+    <w:p>
+      <w:pPr>
+        <w:pStyle w:val="ListParagraph"/>
+        <w:numPr>
+          <w:ilvl w:val="0"/>
+          <w:numId w:val="2"/>
+        </w:numPr>
+        <w:spacing w:after="90" w:line="290"/>
+      </w:pPr>
+      <w:r>
+        <w:t xml:space="preserve">Esta é uma versão preliminar. A primeira revisão crítica foi incorporada (seção 11); novas revisões continuam bem-vindas, e toda correção é registrada publicamente.</w:t>
+      </w:r>
+    </w:p>
+    <w:p>
+      <w:pPr>
+        <w:pStyle w:val="Heading1"/>
+        <w:spacing w:after="160" w:before="360"/>
+      </w:pPr>
+      <w:r>
+        <w:t xml:space="preserve">10. Verifique você mesmo</w:t>
+      </w:r>
+    </w:p>
+    <w:p>
+      <w:pPr>
+        <w:spacing w:after="140" w:line="300"/>
+      </w:pPr>
+      <w:r>
+        <w:t xml:space="preserve">Tudo está disponível para conferência e reprodução:</w:t>
+      </w:r>
+    </w:p>
+    <w:p>
+      <w:pPr>
+        <w:pStyle w:val="ListParagraph"/>
+        <w:numPr>
+          <w:ilvl w:val="0"/>
+          <w:numId w:val="2"/>
+        </w:numPr>
+        <w:spacing w:after="90" w:line="290"/>
+      </w:pPr>
+      <w:r>
         <w:t xml:space="preserve">Repositório completo: </w:t>
       </w:r>
-      <w:hyperlink w:history="1" r:id="rIdntnnxamkidnebcyqrtx6i">
+      <w:hyperlink w:history="1" r:id="rIdhacaotldujq1mkxtmiaoa">
         <w:r>
           <w:rPr>
             <w:rStyle w:val="Hyperlink"/>
@@ -5483,7 +8004,7 @@
       <w:r>
         <w:t xml:space="preserve">Plano pré-registrado: </w:t>
       </w:r>
-      <w:hyperlink w:history="1" r:id="rId47hkm7pvbyclzrctnrxtb">
+      <w:hyperlink w:history="1" r:id="rIdheuhfgzqmsvuly_gnyy4v">
         <w:r>
           <w:rPr>
             <w:rStyle w:val="Hyperlink"/>
@@ -5504,7 +8025,7 @@
       <w:r>
         <w:t xml:space="preserve">Registro de desvios: </w:t>
       </w:r>
-      <w:hyperlink w:history="1" r:id="rIdhb9oozo0h7udiskcvxu9f">
+      <w:hyperlink w:history="1" r:id="rIdkpclzaiouoz39fgqo3mmr">
         <w:r>
           <w:rPr>
             <w:rStyle w:val="Hyperlink"/>
@@ -5525,7 +8046,7 @@
       <w:r>
         <w:t xml:space="preserve">Manifesto com o SHA-256 de cada arquivo: </w:t>
       </w:r>
-      <w:hyperlink w:history="1" r:id="rIdyzqlkbranrxgesjtsy1j8">
+      <w:hyperlink w:history="1" r:id="rIdtqhbvb7bk7njb7zyrlhbe">
         <w:r>
           <w:rPr>
             <w:rStyle w:val="Hyperlink"/>
@@ -5546,7 +8067,7 @@
       <w:r>
         <w:t xml:space="preserve">Relatório técnico consolidado: </w:t>
       </w:r>
-      <w:hyperlink w:history="1" r:id="rIdpiftbgq6olskoakdn3szm">
+      <w:hyperlink w:history="1" r:id="rIdol9ec-fiq6bmjqbjauule">
         <w:r>
           <w:rPr>
             <w:rStyle w:val="Hyperlink"/>
@@ -5567,7 +8088,7 @@
       <w:r>
         <w:t xml:space="preserve">Instruções de reprodução, passo a passo: </w:t>
       </w:r>
-      <w:hyperlink w:history="1" r:id="rId2yrtro2-jlc12bfufhbtv">
+      <w:hyperlink w:history="1" r:id="rIdepseobddf0k1nx5eacvjk">
         <w:r>
           <w:rPr>
             <w:rStyle w:val="Hyperlink"/>
@@ -5582,6 +8103,477 @@
       </w:pPr>
       <w:r>
         <w:t xml:space="preserve">Para conferir um arquivo baixado, calcule o SHA-256 (por exemplo, "certutil -hashfile arquivo SHA256" no Windows ou "sha256sum arquivo" no Linux) e compare com o manifesto. Críticas, erros encontrados e reproduções independentes podem ser enviados pelas issues do repositório.</w:t>
+      </w:r>
+    </w:p>
+    <w:p>
+      <w:pPr>
+        <w:pStyle w:val="Heading1"/>
+        <w:spacing w:after="160" w:before="360"/>
+      </w:pPr>
+      <w:r>
+        <w:t xml:space="preserve">11. A primeira revisão crítica e o que mudou</w:t>
+      </w:r>
+    </w:p>
+    <w:p>
+      <w:pPr>
+        <w:spacing w:after="140" w:line="300"/>
+      </w:pPr>
+      <w:r>
+        <w:t xml:space="preserve">Depois da publicação da versão 1.0, uma revisão independente avaliou a estrutura metodológica como acima da média para uma auditoria independente, mas apontou fragilidades. Todas foram analisadas; o registro completo, ponto a ponto, está em </w:t>
+      </w:r>
+      <w:hyperlink w:history="1" r:id="rIdnzxugq-v_inlroso7s3vn">
+        <w:r>
+          <w:rPr>
+            <w:rStyle w:val="Hyperlink"/>
+          </w:rPr>
+          <w:t xml:space="preserve">docs/revisao_etapa8.md</w:t>
+        </w:r>
+      </w:hyperlink>
+      <w:r>
+        <w:t xml:space="preserve">. Em resumo:</w:t>
+      </w:r>
+    </w:p>
+    <w:tbl>
+      <w:tblPr>
+        <w:tblW w:type="dxa" w:w="9638"/>
+        <w:tblBorders>
+          <w:top w:val="single" w:color="auto" w:sz="4"/>
+          <w:left w:val="single" w:color="auto" w:sz="4"/>
+          <w:bottom w:val="single" w:color="auto" w:sz="4"/>
+          <w:right w:val="single" w:color="auto" w:sz="4"/>
+          <w:insideH w:val="single" w:color="auto" w:sz="4"/>
+          <w:insideV w:val="single" w:color="auto" w:sz="4"/>
+        </w:tblBorders>
+      </w:tblPr>
+      <w:tblGrid>
+        <w:gridCol w:w="4600"/>
+        <w:gridCol w:w="5038"/>
+      </w:tblGrid>
+      <w:tr>
+        <w:trPr>
+          <w:tblHeader/>
+        </w:trPr>
+        <w:tc>
+          <w:tcPr>
+            <w:tcW w:type="dxa" w:w="4600"/>
+            <w:tcBorders>
+              <w:top w:val="single" w:color="D0D5DD" w:sz="4"/>
+              <w:left w:val="single" w:color="D0D5DD" w:sz="4"/>
+              <w:bottom w:val="single" w:color="D0D5DD" w:sz="4"/>
+              <w:right w:val="single" w:color="D0D5DD" w:sz="4"/>
+            </w:tcBorders>
+            <w:shd w:fill="1F4E79" w:color="auto" w:val="clear"/>
+            <w:tcMar>
+              <w:top w:type="dxa" w:w="60"/>
+              <w:left w:type="dxa" w:w="100"/>
+              <w:bottom w:type="dxa" w:w="60"/>
+              <w:right w:type="dxa" w:w="100"/>
+            </w:tcMar>
+          </w:tcPr>
+          <w:p>
+            <w:r>
+              <w:rPr>
+                <w:b/>
+                <w:bCs/>
+                <w:color w:val="FFFFFF"/>
+                <w:sz w:val="18"/>
+                <w:szCs w:val="18"/>
+              </w:rPr>
+              <w:t xml:space="preserve">Ponto levantado</w:t>
+            </w:r>
+          </w:p>
+        </w:tc>
+        <w:tc>
+          <w:tcPr>
+            <w:tcW w:type="dxa" w:w="5038"/>
+            <w:tcBorders>
+              <w:top w:val="single" w:color="D0D5DD" w:sz="4"/>
+              <w:left w:val="single" w:color="D0D5DD" w:sz="4"/>
+              <w:bottom w:val="single" w:color="D0D5DD" w:sz="4"/>
+              <w:right w:val="single" w:color="D0D5DD" w:sz="4"/>
+            </w:tcBorders>
+            <w:shd w:fill="1F4E79" w:color="auto" w:val="clear"/>
+            <w:tcMar>
+              <w:top w:type="dxa" w:w="60"/>
+              <w:left w:type="dxa" w:w="100"/>
+              <w:bottom w:type="dxa" w:w="60"/>
+              <w:right w:type="dxa" w:w="100"/>
+            </w:tcMar>
+          </w:tcPr>
+          <w:p>
+            <w:r>
+              <w:rPr>
+                <w:b/>
+                <w:bCs/>
+                <w:color w:val="FFFFFF"/>
+                <w:sz w:val="18"/>
+                <w:szCs w:val="18"/>
+              </w:rPr>
+              <w:t xml:space="preserve">Resposta na versão 1.1</w:t>
+            </w:r>
+          </w:p>
+        </w:tc>
+      </w:tr>
+      <w:tr>
+        <w:tc>
+          <w:tcPr>
+            <w:tcW w:type="dxa" w:w="4600"/>
+            <w:tcBorders>
+              <w:top w:val="single" w:color="D0D5DD" w:sz="4"/>
+              <w:left w:val="single" w:color="D0D5DD" w:sz="4"/>
+              <w:bottom w:val="single" w:color="D0D5DD" w:sz="4"/>
+              <w:right w:val="single" w:color="D0D5DD" w:sz="4"/>
+            </w:tcBorders>
+            <w:tcMar>
+              <w:top w:type="dxa" w:w="60"/>
+              <w:left w:type="dxa" w:w="100"/>
+              <w:bottom w:type="dxa" w:w="60"/>
+              <w:right w:type="dxa" w:w="100"/>
+            </w:tcMar>
+          </w:tcPr>
+          <w:p>
+            <w:r>
+              <w:rPr>
+                <w:b w:val="false"/>
+                <w:bCs w:val="false"/>
+                <w:sz w:val="18"/>
+                <w:szCs w:val="18"/>
+              </w:rPr>
+              <w:t xml:space="preserve">O horário de um commit não prova a anterioridade do pré-registro</w:t>
+            </w:r>
+          </w:p>
+        </w:tc>
+        <w:tc>
+          <w:tcPr>
+            <w:tcW w:type="dxa" w:w="5038"/>
+            <w:tcBorders>
+              <w:top w:val="single" w:color="D0D5DD" w:sz="4"/>
+              <w:left w:val="single" w:color="D0D5DD" w:sz="4"/>
+              <w:bottom w:val="single" w:color="D0D5DD" w:sz="4"/>
+              <w:right w:val="single" w:color="D0D5DD" w:sz="4"/>
+            </w:tcBorders>
+            <w:tcMar>
+              <w:top w:type="dxa" w:w="60"/>
+              <w:left w:type="dxa" w:w="100"/>
+              <w:bottom w:type="dxa" w:w="60"/>
+              <w:right w:type="dxa" w:w="100"/>
+            </w:tcMar>
+          </w:tcPr>
+          <w:p>
+            <w:r>
+              <w:rPr>
+                <w:b w:val="false"/>
+                <w:bCs w:val="false"/>
+                <w:sz w:val="18"/>
+                <w:szCs w:val="18"/>
+              </w:rPr>
+              <w:t xml:space="preserve">Aceito. Limitação declarada (seção 2.1); planos novos passam a ter carimbo temporal externo antes de executados</w:t>
+            </w:r>
+          </w:p>
+        </w:tc>
+      </w:tr>
+      <w:tr>
+        <w:tc>
+          <w:tcPr>
+            <w:tcW w:type="dxa" w:w="4600"/>
+            <w:tcBorders>
+              <w:top w:val="single" w:color="D0D5DD" w:sz="4"/>
+              <w:left w:val="single" w:color="D0D5DD" w:sz="4"/>
+              <w:bottom w:val="single" w:color="D0D5DD" w:sz="4"/>
+              <w:right w:val="single" w:color="D0D5DD" w:sz="4"/>
+            </w:tcBorders>
+            <w:tcMar>
+              <w:top w:type="dxa" w:w="60"/>
+              <w:left w:type="dxa" w:w="100"/>
+              <w:bottom w:type="dxa" w:w="60"/>
+              <w:right w:type="dxa" w:w="100"/>
+            </w:tcMar>
+          </w:tcPr>
+          <w:p>
+            <w:r>
+              <w:rPr>
+                <w:b w:val="false"/>
+                <w:bCs w:val="false"/>
+                <w:sz w:val="18"/>
+                <w:szCs w:val="18"/>
+              </w:rPr>
+              <w:t xml:space="preserve">A amostra não elimina irregularidades; faltava detalhar exclusões e o cálculo do intervalo; boletim igual à totalização não prova a intenção do eleitor</w:t>
+            </w:r>
+          </w:p>
+        </w:tc>
+        <w:tc>
+          <w:tcPr>
+            <w:tcW w:type="dxa" w:w="5038"/>
+            <w:tcBorders>
+              <w:top w:val="single" w:color="D0D5DD" w:sz="4"/>
+              <w:left w:val="single" w:color="D0D5DD" w:sz="4"/>
+              <w:bottom w:val="single" w:color="D0D5DD" w:sz="4"/>
+              <w:right w:val="single" w:color="D0D5DD" w:sz="4"/>
+            </w:tcBorders>
+            <w:tcMar>
+              <w:top w:type="dxa" w:w="60"/>
+              <w:left w:type="dxa" w:w="100"/>
+              <w:bottom w:type="dxa" w:w="60"/>
+              <w:right w:type="dxa" w:w="100"/>
+            </w:tcMar>
+          </w:tcPr>
+          <w:p>
+            <w:r>
+              <w:rPr>
+                <w:b w:val="false"/>
+                <w:bCs w:val="false"/>
+                <w:sz w:val="18"/>
+                <w:szCs w:val="18"/>
+              </w:rPr>
+              <w:t xml:space="preserve">Aceito. Memória de cálculo, seções excluídas e limite de escopo na seção 3</w:t>
+            </w:r>
+          </w:p>
+        </w:tc>
+      </w:tr>
+      <w:tr>
+        <w:tc>
+          <w:tcPr>
+            <w:tcW w:type="dxa" w:w="4600"/>
+            <w:tcBorders>
+              <w:top w:val="single" w:color="D0D5DD" w:sz="4"/>
+              <w:left w:val="single" w:color="D0D5DD" w:sz="4"/>
+              <w:bottom w:val="single" w:color="D0D5DD" w:sz="4"/>
+              <w:right w:val="single" w:color="D0D5DD" w:sz="4"/>
+            </w:tcBorders>
+            <w:tcMar>
+              <w:top w:type="dxa" w:w="60"/>
+              <w:left w:type="dxa" w:w="100"/>
+              <w:bottom w:type="dxa" w:w="60"/>
+              <w:right w:type="dxa" w:w="100"/>
+            </w:tcMar>
+          </w:tcPr>
+          <w:p>
+            <w:r>
+              <w:rPr>
+                <w:b w:val="false"/>
+                <w:bCs w:val="false"/>
+                <w:sz w:val="18"/>
+                <w:szCs w:val="18"/>
+              </w:rPr>
+              <w:t xml:space="preserve">O modelo geográfico precisava de mais transparência e de testes de robustez; o uso do Censo 2022 nos anos anteriores</w:t>
+            </w:r>
+          </w:p>
+        </w:tc>
+        <w:tc>
+          <w:tcPr>
+            <w:tcW w:type="dxa" w:w="5038"/>
+            <w:tcBorders>
+              <w:top w:val="single" w:color="D0D5DD" w:sz="4"/>
+              <w:left w:val="single" w:color="D0D5DD" w:sz="4"/>
+              <w:bottom w:val="single" w:color="D0D5DD" w:sz="4"/>
+              <w:right w:val="single" w:color="D0D5DD" w:sz="4"/>
+            </w:tcBorders>
+            <w:tcMar>
+              <w:top w:type="dxa" w:w="60"/>
+              <w:left w:type="dxa" w:w="100"/>
+              <w:bottom w:type="dxa" w:w="60"/>
+              <w:right w:type="dxa" w:w="100"/>
+            </w:tcMar>
+          </w:tcPr>
+          <w:p>
+            <w:r>
+              <w:rPr>
+                <w:b w:val="false"/>
+                <w:bCs w:val="false"/>
+                <w:sz w:val="18"/>
+                <w:szCs w:val="18"/>
+              </w:rPr>
+              <w:t xml:space="preserve">Aceito. Distribuição das seções atípicas, quatro especificações alternativas e modelo municipal sem o Censo (seções 4.1 a 4.3); uma delas deixou resultado sem explicação demonstrada, reportado</w:t>
+            </w:r>
+          </w:p>
+        </w:tc>
+      </w:tr>
+      <w:tr>
+        <w:tc>
+          <w:tcPr>
+            <w:tcW w:type="dxa" w:w="4600"/>
+            <w:tcBorders>
+              <w:top w:val="single" w:color="D0D5DD" w:sz="4"/>
+              <w:left w:val="single" w:color="D0D5DD" w:sz="4"/>
+              <w:bottom w:val="single" w:color="D0D5DD" w:sz="4"/>
+              <w:right w:val="single" w:color="D0D5DD" w:sz="4"/>
+            </w:tcBorders>
+            <w:tcMar>
+              <w:top w:type="dxa" w:w="60"/>
+              <w:left w:type="dxa" w:w="100"/>
+              <w:bottom w:type="dxa" w:w="60"/>
+              <w:right w:type="dxa" w:w="100"/>
+            </w:tcMar>
+          </w:tcPr>
+          <w:p>
+            <w:r>
+              <w:rPr>
+                <w:b w:val="false"/>
+                <w:bCs w:val="false"/>
+                <w:sz w:val="18"/>
+                <w:szCs w:val="18"/>
+              </w:rPr>
+              <w:t xml:space="preserve">A comparação internacional é limitada; os 49% não são uma probabilidade precisa</w:t>
+            </w:r>
+          </w:p>
+        </w:tc>
+        <w:tc>
+          <w:tcPr>
+            <w:tcW w:type="dxa" w:w="5038"/>
+            <w:tcBorders>
+              <w:top w:val="single" w:color="D0D5DD" w:sz="4"/>
+              <w:left w:val="single" w:color="D0D5DD" w:sz="4"/>
+              <w:bottom w:val="single" w:color="D0D5DD" w:sz="4"/>
+              <w:right w:val="single" w:color="D0D5DD" w:sz="4"/>
+            </w:tcBorders>
+            <w:tcMar>
+              <w:top w:type="dxa" w:w="60"/>
+              <w:left w:type="dxa" w:w="100"/>
+              <w:bottom w:type="dxa" w:w="60"/>
+              <w:right w:type="dxa" w:w="100"/>
+            </w:tcMar>
+          </w:tcPr>
+          <w:p>
+            <w:r>
+              <w:rPr>
+                <w:b w:val="false"/>
+                <w:bCs w:val="false"/>
+                <w:sz w:val="18"/>
+                <w:szCs w:val="18"/>
+              </w:rPr>
+              <w:t xml:space="preserve">Aceito. Texto revisto (seção 7.1)</w:t>
+            </w:r>
+          </w:p>
+        </w:tc>
+      </w:tr>
+      <w:tr>
+        <w:tc>
+          <w:tcPr>
+            <w:tcW w:type="dxa" w:w="4600"/>
+            <w:tcBorders>
+              <w:top w:val="single" w:color="D0D5DD" w:sz="4"/>
+              <w:left w:val="single" w:color="D0D5DD" w:sz="4"/>
+              <w:bottom w:val="single" w:color="D0D5DD" w:sz="4"/>
+              <w:right w:val="single" w:color="D0D5DD" w:sz="4"/>
+            </w:tcBorders>
+            <w:tcMar>
+              <w:top w:type="dxa" w:w="60"/>
+              <w:left w:type="dxa" w:w="100"/>
+              <w:bottom w:type="dxa" w:w="60"/>
+              <w:right w:type="dxa" w:w="100"/>
+            </w:tcMar>
+          </w:tcPr>
+          <w:p>
+            <w:r>
+              <w:rPr>
+                <w:b w:val="false"/>
+                <w:bCs w:val="false"/>
+                <w:sz w:val="18"/>
+                <w:szCs w:val="18"/>
+              </w:rPr>
+              <w:t xml:space="preserve">O erro das pesquisas merece estudo próprio; as pesquisas não são independentes</w:t>
+            </w:r>
+          </w:p>
+        </w:tc>
+        <w:tc>
+          <w:tcPr>
+            <w:tcW w:type="dxa" w:w="5038"/>
+            <w:tcBorders>
+              <w:top w:val="single" w:color="D0D5DD" w:sz="4"/>
+              <w:left w:val="single" w:color="D0D5DD" w:sz="4"/>
+              <w:bottom w:val="single" w:color="D0D5DD" w:sz="4"/>
+              <w:right w:val="single" w:color="D0D5DD" w:sz="4"/>
+            </w:tcBorders>
+            <w:tcMar>
+              <w:top w:type="dxa" w:w="60"/>
+              <w:left w:type="dxa" w:w="100"/>
+              <w:bottom w:type="dxa" w:w="60"/>
+              <w:right w:type="dxa" w:w="100"/>
+            </w:tcMar>
+          </w:tcPr>
+          <w:p>
+            <w:r>
+              <w:rPr>
+                <w:b w:val="false"/>
+                <w:bCs w:val="false"/>
+                <w:sz w:val="18"/>
+                <w:szCs w:val="18"/>
+              </w:rPr>
+              <w:t xml:space="preserve">Aceito. Ressalva incluída (seção 6); mecanismos ficam para estudo à parte</w:t>
+            </w:r>
+          </w:p>
+        </w:tc>
+      </w:tr>
+      <w:tr>
+        <w:tc>
+          <w:tcPr>
+            <w:tcW w:type="dxa" w:w="4600"/>
+            <w:tcBorders>
+              <w:top w:val="single" w:color="D0D5DD" w:sz="4"/>
+              <w:left w:val="single" w:color="D0D5DD" w:sz="4"/>
+              <w:bottom w:val="single" w:color="D0D5DD" w:sz="4"/>
+              <w:right w:val="single" w:color="D0D5DD" w:sz="4"/>
+            </w:tcBorders>
+            <w:tcMar>
+              <w:top w:type="dxa" w:w="60"/>
+              <w:left w:type="dxa" w:w="100"/>
+              <w:bottom w:type="dxa" w:w="60"/>
+              <w:right w:type="dxa" w:w="100"/>
+            </w:tcMar>
+          </w:tcPr>
+          <w:p>
+            <w:r>
+              <w:rPr>
+                <w:b w:val="false"/>
+                <w:bCs w:val="false"/>
+                <w:sz w:val="18"/>
+                <w:szCs w:val="18"/>
+              </w:rPr>
+              <w:t xml:space="preserve">O veredito podia ser lido como explicação causal definitiva e como prova de ausência de fraude</w:t>
+            </w:r>
+          </w:p>
+        </w:tc>
+        <w:tc>
+          <w:tcPr>
+            <w:tcW w:type="dxa" w:w="5038"/>
+            <w:tcBorders>
+              <w:top w:val="single" w:color="D0D5DD" w:sz="4"/>
+              <w:left w:val="single" w:color="D0D5DD" w:sz="4"/>
+              <w:bottom w:val="single" w:color="D0D5DD" w:sz="4"/>
+              <w:right w:val="single" w:color="D0D5DD" w:sz="4"/>
+            </w:tcBorders>
+            <w:tcMar>
+              <w:top w:type="dxa" w:w="60"/>
+              <w:left w:type="dxa" w:w="100"/>
+              <w:bottom w:type="dxa" w:w="60"/>
+              <w:right w:type="dxa" w:w="100"/>
+            </w:tcMar>
+          </w:tcPr>
+          <w:p>
+            <w:r>
+              <w:rPr>
+                <w:b w:val="false"/>
+                <w:bCs w:val="false"/>
+                <w:sz w:val="18"/>
+                <w:szCs w:val="18"/>
+              </w:rPr>
+              <w:t xml:space="preserve">Aceito. Veredito reescrito e alcance das conclusões explicitado (seção 8)</w:t>
+            </w:r>
+          </w:p>
+        </w:tc>
+      </w:tr>
+    </w:tbl>
+    <w:p>
+      <w:pPr>
+        <w:spacing w:after="120"/>
+      </w:pPr>
+    </w:p>
+    <w:p>
+      <w:pPr>
+        <w:spacing w:after="140" w:line="300"/>
+      </w:pPr>
+      <w:r>
+        <w:t xml:space="preserve">A recomendação final do revisor foi não apresentar o trabalho como auditoria conclusiva, mas mantê-lo aberto e reproduzível, capaz de sobreviver a revisões hostis, inclusive de quem discorde das conclusões. Esta versão segue essa recomendação.</w:t>
       </w:r>
     </w:p>
     <w:p>
@@ -6395,7 +9387,7 @@
         <w:sz w:val="16"/>
         <w:szCs w:val="16"/>
       </w:rPr>
-      <w:t xml:space="preserve">Versão preliminar · github.com/leandropitol/auditoria-eleicao-2026 · página </w:t>
+      <w:t xml:space="preserve">Versão 1.1 (preliminar) · github.com/leandropitol/auditoria-eleicao-2026 · página </w:t>
     </w:r>
     <w:r>
       <w:rPr>

</xml_diff>